<commit_message>
add grafik profil karyawan
minus options & fix bug showing data absensi
</commit_message>
<xml_diff>
--- a/project/kepegawaian/Evaluasi Absensi 11 Apr.docx
+++ b/project/kepegawaian/Evaluasi Absensi 11 Apr.docx
@@ -31,17 +31,107 @@
           <w:lang w:val="en-US"/>
         </w:rPr>
       </w:pPr>
-      <w:r>
-        <w:rPr>
-          <w:lang w:val="en-US"/>
-        </w:rPr>
-        <w:t>Rekap absensi untuk kepegawaian</w:t>
-      </w:r>
-      <w:r>
-        <w:rPr>
-          <w:lang w:val="en-US"/>
-        </w:rPr>
-        <w:t xml:space="preserve"> (diurutkan berdasarkan unit)</w:t>
+      <w:proofErr w:type="spellStart"/>
+      <w:r>
+        <w:rPr>
+          <w:lang w:val="en-US"/>
+        </w:rPr>
+        <w:t>R</w:t>
+      </w:r>
+      <w:r>
+        <w:rPr>
+          <w:strike/>
+          <w:lang w:val="en-US"/>
+        </w:rPr>
+        <w:t>ekap</w:t>
+      </w:r>
+      <w:proofErr w:type="spellEnd"/>
+      <w:r>
+        <w:rPr>
+          <w:strike/>
+          <w:lang w:val="en-US"/>
+        </w:rPr>
+        <w:t xml:space="preserve"> </w:t>
+      </w:r>
+      <w:proofErr w:type="spellStart"/>
+      <w:r>
+        <w:rPr>
+          <w:strike/>
+          <w:lang w:val="en-US"/>
+        </w:rPr>
+        <w:t>absensi</w:t>
+      </w:r>
+      <w:proofErr w:type="spellEnd"/>
+      <w:r>
+        <w:rPr>
+          <w:strike/>
+          <w:lang w:val="en-US"/>
+        </w:rPr>
+        <w:t xml:space="preserve"> </w:t>
+      </w:r>
+      <w:proofErr w:type="spellStart"/>
+      <w:r>
+        <w:rPr>
+          <w:strike/>
+          <w:lang w:val="en-US"/>
+        </w:rPr>
+        <w:t>untuk</w:t>
+      </w:r>
+      <w:proofErr w:type="spellEnd"/>
+      <w:r>
+        <w:rPr>
+          <w:strike/>
+          <w:lang w:val="en-US"/>
+        </w:rPr>
+        <w:t xml:space="preserve"> </w:t>
+      </w:r>
+      <w:proofErr w:type="spellStart"/>
+      <w:r>
+        <w:rPr>
+          <w:strike/>
+          <w:lang w:val="en-US"/>
+        </w:rPr>
+        <w:t>kepegawaian</w:t>
+      </w:r>
+      <w:proofErr w:type="spellEnd"/>
+      <w:r>
+        <w:rPr>
+          <w:strike/>
+          <w:lang w:val="en-US"/>
+        </w:rPr>
+        <w:t xml:space="preserve"> (</w:t>
+      </w:r>
+      <w:proofErr w:type="spellStart"/>
+      <w:r>
+        <w:rPr>
+          <w:strike/>
+          <w:lang w:val="en-US"/>
+        </w:rPr>
+        <w:t>diurutkan</w:t>
+      </w:r>
+      <w:proofErr w:type="spellEnd"/>
+      <w:r>
+        <w:rPr>
+          <w:strike/>
+          <w:lang w:val="en-US"/>
+        </w:rPr>
+        <w:t xml:space="preserve"> </w:t>
+      </w:r>
+      <w:proofErr w:type="spellStart"/>
+      <w:r>
+        <w:rPr>
+          <w:strike/>
+          <w:lang w:val="en-US"/>
+        </w:rPr>
+        <w:t>berdasarkan</w:t>
+      </w:r>
+      <w:proofErr w:type="spellEnd"/>
+      <w:r>
+        <w:rPr>
+          <w:strike/>
+          <w:lang w:val="en-US"/>
+        </w:rPr>
+        <w:t xml:space="preserve"> unit)</w:t>
       </w:r>
     </w:p>
     <w:p>
@@ -55,17 +145,151 @@
           <w:lang w:val="en-US"/>
         </w:rPr>
       </w:pPr>
-      <w:r>
-        <w:rPr>
-          <w:lang w:val="en-US"/>
-        </w:rPr>
-        <w:t xml:space="preserve">Rekap </w:t>
-      </w:r>
-      <w:r>
-        <w:rPr>
-          <w:lang w:val="en-US"/>
-        </w:rPr>
-        <w:t>Laporan Absensi ke MPKU PWM karyawan diurutkan bdsr excel Linda (kolom per bulan) isian format dalam %</w:t>
+      <w:proofErr w:type="spellStart"/>
+      <w:r>
+        <w:rPr>
+          <w:lang w:val="en-US"/>
+        </w:rPr>
+        <w:t>Rekap</w:t>
+      </w:r>
+      <w:proofErr w:type="spellEnd"/>
+      <w:r>
+        <w:rPr>
+          <w:lang w:val="en-US"/>
+        </w:rPr>
+        <w:t xml:space="preserve"> </w:t>
+      </w:r>
+      <w:r>
+        <w:rPr>
+          <w:lang w:val="en-US"/>
+        </w:rPr>
+        <w:t xml:space="preserve">Laporan </w:t>
+      </w:r>
+      <w:proofErr w:type="spellStart"/>
+      <w:r>
+        <w:rPr>
+          <w:lang w:val="en-US"/>
+        </w:rPr>
+        <w:t>Absensi</w:t>
+      </w:r>
+      <w:proofErr w:type="spellEnd"/>
+      <w:r>
+        <w:rPr>
+          <w:lang w:val="en-US"/>
+        </w:rPr>
+        <w:t xml:space="preserve"> </w:t>
+      </w:r>
+      <w:proofErr w:type="spellStart"/>
+      <w:r>
+        <w:rPr>
+          <w:lang w:val="en-US"/>
+        </w:rPr>
+        <w:t>ke</w:t>
+      </w:r>
+      <w:proofErr w:type="spellEnd"/>
+      <w:r>
+        <w:rPr>
+          <w:lang w:val="en-US"/>
+        </w:rPr>
+        <w:t xml:space="preserve"> MPKU PWM </w:t>
+      </w:r>
+      <w:proofErr w:type="spellStart"/>
+      <w:r>
+        <w:rPr>
+          <w:lang w:val="en-US"/>
+        </w:rPr>
+        <w:t>karyawan</w:t>
+      </w:r>
+      <w:proofErr w:type="spellEnd"/>
+      <w:r>
+        <w:rPr>
+          <w:lang w:val="en-US"/>
+        </w:rPr>
+        <w:t xml:space="preserve"> </w:t>
+      </w:r>
+      <w:proofErr w:type="spellStart"/>
+      <w:r>
+        <w:rPr>
+          <w:lang w:val="en-US"/>
+        </w:rPr>
+        <w:t>diurutkan</w:t>
+      </w:r>
+      <w:proofErr w:type="spellEnd"/>
+      <w:r>
+        <w:rPr>
+          <w:lang w:val="en-US"/>
+        </w:rPr>
+        <w:t xml:space="preserve"> </w:t>
+      </w:r>
+      <w:proofErr w:type="spellStart"/>
+      <w:r>
+        <w:rPr>
+          <w:lang w:val="en-US"/>
+        </w:rPr>
+        <w:t>bdsr</w:t>
+      </w:r>
+      <w:proofErr w:type="spellEnd"/>
+      <w:r>
+        <w:rPr>
+          <w:lang w:val="en-US"/>
+        </w:rPr>
+        <w:t xml:space="preserve"> excel Linda (</w:t>
+      </w:r>
+      <w:proofErr w:type="spellStart"/>
+      <w:r>
+        <w:rPr>
+          <w:lang w:val="en-US"/>
+        </w:rPr>
+        <w:t>kolom</w:t>
+      </w:r>
+      <w:proofErr w:type="spellEnd"/>
+      <w:r>
+        <w:rPr>
+          <w:lang w:val="en-US"/>
+        </w:rPr>
+        <w:t xml:space="preserve"> per </w:t>
+      </w:r>
+      <w:proofErr w:type="spellStart"/>
+      <w:r>
+        <w:rPr>
+          <w:lang w:val="en-US"/>
+        </w:rPr>
+        <w:t>bulan</w:t>
+      </w:r>
+      <w:proofErr w:type="spellEnd"/>
+      <w:r>
+        <w:rPr>
+          <w:lang w:val="en-US"/>
+        </w:rPr>
+        <w:t xml:space="preserve">) </w:t>
+      </w:r>
+      <w:proofErr w:type="spellStart"/>
+      <w:r>
+        <w:rPr>
+          <w:lang w:val="en-US"/>
+        </w:rPr>
+        <w:t>isian</w:t>
+      </w:r>
+      <w:proofErr w:type="spellEnd"/>
+      <w:r>
+        <w:rPr>
+          <w:lang w:val="en-US"/>
+        </w:rPr>
+        <w:t xml:space="preserve"> format </w:t>
+      </w:r>
+      <w:proofErr w:type="spellStart"/>
+      <w:r>
+        <w:rPr>
+          <w:lang w:val="en-US"/>
+        </w:rPr>
+        <w:t>dalam</w:t>
+      </w:r>
+      <w:proofErr w:type="spellEnd"/>
+      <w:r>
+        <w:rPr>
+          <w:lang w:val="en-US"/>
+        </w:rPr>
+        <w:t xml:space="preserve"> %</w:t>
       </w:r>
     </w:p>
     <w:p>
@@ -79,11 +303,19 @@
           <w:lang w:val="en-US"/>
         </w:rPr>
       </w:pPr>
-      <w:r>
-        <w:rPr>
-          <w:lang w:val="en-US"/>
-        </w:rPr>
-        <w:t xml:space="preserve">Grafik </w:t>
+      <w:proofErr w:type="spellStart"/>
+      <w:r>
+        <w:rPr>
+          <w:lang w:val="en-US"/>
+        </w:rPr>
+        <w:t>Grafik</w:t>
+      </w:r>
+      <w:proofErr w:type="spellEnd"/>
+      <w:r>
+        <w:rPr>
+          <w:lang w:val="en-US"/>
+        </w:rPr>
+        <w:t xml:space="preserve"> </w:t>
       </w:r>
     </w:p>
     <w:p>
@@ -97,11 +329,103 @@
           <w:lang w:val="en-US"/>
         </w:rPr>
       </w:pPr>
-      <w:r>
-        <w:rPr>
-          <w:lang w:val="en-US"/>
-        </w:rPr>
-        <w:t>Ijin (keluarga meninggal, menunggu suamiistri/anak sakit)</w:t>
+      <w:proofErr w:type="spellStart"/>
+      <w:r>
+        <w:rPr>
+          <w:lang w:val="en-US"/>
+        </w:rPr>
+        <w:t>Ijin</w:t>
+      </w:r>
+      <w:proofErr w:type="spellEnd"/>
+      <w:r>
+        <w:rPr>
+          <w:lang w:val="en-US"/>
+        </w:rPr>
+        <w:t xml:space="preserve"> (</w:t>
+      </w:r>
+      <w:proofErr w:type="spellStart"/>
+      <w:r>
+        <w:rPr>
+          <w:lang w:val="en-US"/>
+        </w:rPr>
+        <w:t>keluarga</w:t>
+      </w:r>
+      <w:proofErr w:type="spellEnd"/>
+      <w:r>
+        <w:rPr>
+          <w:lang w:val="en-US"/>
+        </w:rPr>
+        <w:t xml:space="preserve"> </w:t>
+      </w:r>
+      <w:proofErr w:type="spellStart"/>
+      <w:r>
+        <w:rPr>
+          <w:lang w:val="en-US"/>
+        </w:rPr>
+        <w:t>meninggal</w:t>
+      </w:r>
+      <w:proofErr w:type="spellEnd"/>
+      <w:r>
+        <w:rPr>
+          <w:lang w:val="en-US"/>
+        </w:rPr>
+        <w:t xml:space="preserve">, </w:t>
+      </w:r>
+      <w:proofErr w:type="spellStart"/>
+      <w:r>
+        <w:rPr>
+          <w:lang w:val="en-US"/>
+        </w:rPr>
+        <w:t>menunggu</w:t>
+      </w:r>
+      <w:proofErr w:type="spellEnd"/>
+      <w:r>
+        <w:rPr>
+          <w:lang w:val="en-US"/>
+        </w:rPr>
+        <w:t xml:space="preserve"> </w:t>
+      </w:r>
+      <w:proofErr w:type="spellStart"/>
+      <w:r>
+        <w:rPr>
+          <w:lang w:val="en-US"/>
+        </w:rPr>
+        <w:t>suamiistri</w:t>
+      </w:r>
+      <w:proofErr w:type="spellEnd"/>
+      <w:r>
+        <w:rPr>
+          <w:lang w:val="en-US"/>
+        </w:rPr>
+        <w:t>/</w:t>
+      </w:r>
+      <w:proofErr w:type="spellStart"/>
+      <w:r>
+        <w:rPr>
+          <w:lang w:val="en-US"/>
+        </w:rPr>
+        <w:t>anak</w:t>
+      </w:r>
+      <w:proofErr w:type="spellEnd"/>
+      <w:r>
+        <w:rPr>
+          <w:lang w:val="en-US"/>
+        </w:rPr>
+        <w:t xml:space="preserve"> </w:t>
+      </w:r>
+      <w:proofErr w:type="spellStart"/>
+      <w:r>
+        <w:rPr>
+          <w:lang w:val="en-US"/>
+        </w:rPr>
+        <w:t>sakit</w:t>
+      </w:r>
+      <w:proofErr w:type="spellEnd"/>
+      <w:r>
+        <w:rPr>
+          <w:lang w:val="en-US"/>
+        </w:rPr>
+        <w:t>)</w:t>
       </w:r>
     </w:p>
     <w:p>
@@ -112,15 +436,154 @@
           <w:numId w:val="1"/>
         </w:numPr>
         <w:rPr>
-          <w:lang w:val="en-US"/>
-        </w:rPr>
-      </w:pPr>
-      <w:r>
-        <w:rPr>
-          <w:lang w:val="en-US"/>
-        </w:rPr>
-        <w:t>Table riwayat = Filter ditambah nama pegawai (data absen tgl 21-20) terkait penghitungan insentif kehadiran</w:t>
-      </w:r>
+          <w:strike/>
+          <w:lang w:val="en-US"/>
+        </w:rPr>
+      </w:pPr>
+      <w:r>
+        <w:rPr>
+          <w:strike/>
+          <w:lang w:val="en-US"/>
+        </w:rPr>
+        <w:t xml:space="preserve">Table </w:t>
+      </w:r>
+      <w:proofErr w:type="spellStart"/>
+      <w:r>
+        <w:rPr>
+          <w:strike/>
+          <w:lang w:val="en-US"/>
+        </w:rPr>
+        <w:t>riwayat</w:t>
+      </w:r>
+      <w:proofErr w:type="spellEnd"/>
+      <w:r>
+        <w:rPr>
+          <w:strike/>
+          <w:lang w:val="en-US"/>
+        </w:rPr>
+        <w:t xml:space="preserve"> = Filter </w:t>
+      </w:r>
+      <w:proofErr w:type="spellStart"/>
+      <w:r>
+        <w:rPr>
+          <w:strike/>
+          <w:lang w:val="en-US"/>
+        </w:rPr>
+        <w:t>ditambah</w:t>
+      </w:r>
+      <w:proofErr w:type="spellEnd"/>
+      <w:r>
+        <w:rPr>
+          <w:strike/>
+          <w:lang w:val="en-US"/>
+        </w:rPr>
+        <w:t xml:space="preserve"> nama </w:t>
+      </w:r>
+      <w:proofErr w:type="spellStart"/>
+      <w:r>
+        <w:rPr>
+          <w:strike/>
+          <w:lang w:val="en-US"/>
+        </w:rPr>
+        <w:t>pegawai</w:t>
+      </w:r>
+      <w:proofErr w:type="spellEnd"/>
+      <w:r>
+        <w:rPr>
+          <w:strike/>
+          <w:lang w:val="en-US"/>
+        </w:rPr>
+        <w:t xml:space="preserve"> (data </w:t>
+      </w:r>
+      <w:proofErr w:type="spellStart"/>
+      <w:r>
+        <w:rPr>
+          <w:strike/>
+          <w:lang w:val="en-US"/>
+        </w:rPr>
+        <w:t>absen</w:t>
+      </w:r>
+      <w:proofErr w:type="spellEnd"/>
+      <w:r>
+        <w:rPr>
+          <w:strike/>
+          <w:lang w:val="en-US"/>
+        </w:rPr>
+        <w:t xml:space="preserve"> </w:t>
+      </w:r>
+      <w:proofErr w:type="spellStart"/>
+      <w:r>
+        <w:rPr>
+          <w:strike/>
+          <w:lang w:val="en-US"/>
+        </w:rPr>
+        <w:t>tgl</w:t>
+      </w:r>
+      <w:proofErr w:type="spellEnd"/>
+      <w:r>
+        <w:rPr>
+          <w:strike/>
+          <w:lang w:val="en-US"/>
+        </w:rPr>
+        <w:t xml:space="preserve"> 21-20) </w:t>
+      </w:r>
+      <w:proofErr w:type="spellStart"/>
+      <w:r>
+        <w:rPr>
+          <w:strike/>
+          <w:lang w:val="en-US"/>
+        </w:rPr>
+        <w:t>terkait</w:t>
+      </w:r>
+      <w:proofErr w:type="spellEnd"/>
+      <w:r>
+        <w:rPr>
+          <w:strike/>
+          <w:lang w:val="en-US"/>
+        </w:rPr>
+        <w:t xml:space="preserve"> </w:t>
+      </w:r>
+      <w:proofErr w:type="spellStart"/>
+      <w:r>
+        <w:rPr>
+          <w:strike/>
+          <w:lang w:val="en-US"/>
+        </w:rPr>
+        <w:t>penghitungan</w:t>
+      </w:r>
+      <w:proofErr w:type="spellEnd"/>
+      <w:r>
+        <w:rPr>
+          <w:strike/>
+          <w:lang w:val="en-US"/>
+        </w:rPr>
+        <w:t xml:space="preserve"> </w:t>
+      </w:r>
+      <w:proofErr w:type="spellStart"/>
+      <w:r>
+        <w:rPr>
+          <w:strike/>
+          <w:lang w:val="en-US"/>
+        </w:rPr>
+        <w:t>insentif</w:t>
+      </w:r>
+      <w:proofErr w:type="spellEnd"/>
+      <w:r>
+        <w:rPr>
+          <w:strike/>
+          <w:lang w:val="en-US"/>
+        </w:rPr>
+        <w:t xml:space="preserve"> </w:t>
+      </w:r>
+      <w:proofErr w:type="spellStart"/>
+      <w:r>
+        <w:rPr>
+          <w:strike/>
+          <w:lang w:val="en-US"/>
+        </w:rPr>
+        <w:t>kehadiran</w:t>
+      </w:r>
+      <w:proofErr w:type="spellEnd"/>
     </w:p>
     <w:p>
       <w:pPr>
@@ -130,14 +593,57 @@
           <w:numId w:val="1"/>
         </w:numPr>
         <w:rPr>
-          <w:lang w:val="en-US"/>
-        </w:rPr>
-      </w:pPr>
-      <w:r>
-        <w:rPr>
-          <w:lang w:val="en-US"/>
-        </w:rPr>
-        <w:t>Maksimal absen pulang +2 jam</w:t>
+          <w:strike/>
+          <w:lang w:val="en-US"/>
+        </w:rPr>
+      </w:pPr>
+      <w:proofErr w:type="spellStart"/>
+      <w:r>
+        <w:rPr>
+          <w:strike/>
+          <w:lang w:val="en-US"/>
+        </w:rPr>
+        <w:t>Maksimal</w:t>
+      </w:r>
+      <w:proofErr w:type="spellEnd"/>
+      <w:r>
+        <w:rPr>
+          <w:strike/>
+          <w:lang w:val="en-US"/>
+        </w:rPr>
+        <w:t xml:space="preserve"> </w:t>
+      </w:r>
+      <w:proofErr w:type="spellStart"/>
+      <w:r>
+        <w:rPr>
+          <w:strike/>
+          <w:lang w:val="en-US"/>
+        </w:rPr>
+        <w:t>absen</w:t>
+      </w:r>
+      <w:proofErr w:type="spellEnd"/>
+      <w:r>
+        <w:rPr>
+          <w:strike/>
+          <w:lang w:val="en-US"/>
+        </w:rPr>
+        <w:t xml:space="preserve"> </w:t>
+      </w:r>
+      <w:proofErr w:type="spellStart"/>
+      <w:r>
+        <w:rPr>
+          <w:strike/>
+          <w:lang w:val="en-US"/>
+        </w:rPr>
+        <w:t>pulang</w:t>
+      </w:r>
+      <w:proofErr w:type="spellEnd"/>
+      <w:r>
+        <w:rPr>
+          <w:strike/>
+          <w:lang w:val="en-US"/>
+        </w:rPr>
+        <w:t xml:space="preserve"> +2 jam</w:t>
       </w:r>
     </w:p>
     <w:p>
@@ -151,11 +657,103 @@
           <w:lang w:val="en-US"/>
         </w:rPr>
       </w:pPr>
-      <w:r>
-        <w:rPr>
-          <w:lang w:val="en-US"/>
-        </w:rPr>
-        <w:t>Apabila di hari tsb tidak absen masuk &amp; pulang (ALPHA)</w:t>
+      <w:proofErr w:type="spellStart"/>
+      <w:r>
+        <w:rPr>
+          <w:lang w:val="en-US"/>
+        </w:rPr>
+        <w:t>Apabila</w:t>
+      </w:r>
+      <w:proofErr w:type="spellEnd"/>
+      <w:r>
+        <w:rPr>
+          <w:lang w:val="en-US"/>
+        </w:rPr>
+        <w:t xml:space="preserve"> di </w:t>
+      </w:r>
+      <w:proofErr w:type="spellStart"/>
+      <w:r>
+        <w:rPr>
+          <w:lang w:val="en-US"/>
+        </w:rPr>
+        <w:t>hari</w:t>
+      </w:r>
+      <w:proofErr w:type="spellEnd"/>
+      <w:r>
+        <w:rPr>
+          <w:lang w:val="en-US"/>
+        </w:rPr>
+        <w:t xml:space="preserve"> </w:t>
+      </w:r>
+      <w:proofErr w:type="spellStart"/>
+      <w:r>
+        <w:rPr>
+          <w:lang w:val="en-US"/>
+        </w:rPr>
+        <w:t>tsb</w:t>
+      </w:r>
+      <w:proofErr w:type="spellEnd"/>
+      <w:r>
+        <w:rPr>
+          <w:lang w:val="en-US"/>
+        </w:rPr>
+        <w:t xml:space="preserve"> </w:t>
+      </w:r>
+      <w:proofErr w:type="spellStart"/>
+      <w:r>
+        <w:rPr>
+          <w:lang w:val="en-US"/>
+        </w:rPr>
+        <w:t>tidak</w:t>
+      </w:r>
+      <w:proofErr w:type="spellEnd"/>
+      <w:r>
+        <w:rPr>
+          <w:lang w:val="en-US"/>
+        </w:rPr>
+        <w:t xml:space="preserve"> </w:t>
+      </w:r>
+      <w:proofErr w:type="spellStart"/>
+      <w:r>
+        <w:rPr>
+          <w:lang w:val="en-US"/>
+        </w:rPr>
+        <w:t>absen</w:t>
+      </w:r>
+      <w:proofErr w:type="spellEnd"/>
+      <w:r>
+        <w:rPr>
+          <w:lang w:val="en-US"/>
+        </w:rPr>
+        <w:t xml:space="preserve"> </w:t>
+      </w:r>
+      <w:proofErr w:type="spellStart"/>
+      <w:r>
+        <w:rPr>
+          <w:lang w:val="en-US"/>
+        </w:rPr>
+        <w:t>masuk</w:t>
+      </w:r>
+      <w:proofErr w:type="spellEnd"/>
+      <w:r>
+        <w:rPr>
+          <w:lang w:val="en-US"/>
+        </w:rPr>
+        <w:t xml:space="preserve"> &amp; </w:t>
+      </w:r>
+      <w:proofErr w:type="spellStart"/>
+      <w:r>
+        <w:rPr>
+          <w:lang w:val="en-US"/>
+        </w:rPr>
+        <w:t>pulang</w:t>
+      </w:r>
+      <w:proofErr w:type="spellEnd"/>
+      <w:r>
+        <w:rPr>
+          <w:lang w:val="en-US"/>
+        </w:rPr>
+        <w:t xml:space="preserve"> (ALPHA)</w:t>
       </w:r>
     </w:p>
     <w:p>
@@ -169,11 +767,47 @@
           <w:lang w:val="en-US"/>
         </w:rPr>
       </w:pPr>
-      <w:r>
-        <w:rPr>
-          <w:lang w:val="en-US"/>
-        </w:rPr>
-        <w:t>Tambah keterangan juml Alpha di Dashboard E</w:t>
+      <w:proofErr w:type="spellStart"/>
+      <w:r>
+        <w:rPr>
+          <w:lang w:val="en-US"/>
+        </w:rPr>
+        <w:t>Tambah</w:t>
+      </w:r>
+      <w:proofErr w:type="spellEnd"/>
+      <w:r>
+        <w:rPr>
+          <w:lang w:val="en-US"/>
+        </w:rPr>
+        <w:t xml:space="preserve"> </w:t>
+      </w:r>
+      <w:proofErr w:type="spellStart"/>
+      <w:r>
+        <w:rPr>
+          <w:lang w:val="en-US"/>
+        </w:rPr>
+        <w:t>keterangan</w:t>
+      </w:r>
+      <w:proofErr w:type="spellEnd"/>
+      <w:r>
+        <w:rPr>
+          <w:lang w:val="en-US"/>
+        </w:rPr>
+        <w:t xml:space="preserve"> </w:t>
+      </w:r>
+      <w:proofErr w:type="spellStart"/>
+      <w:r>
+        <w:rPr>
+          <w:lang w:val="en-US"/>
+        </w:rPr>
+        <w:t>juml</w:t>
+      </w:r>
+      <w:proofErr w:type="spellEnd"/>
+      <w:r>
+        <w:rPr>
+          <w:lang w:val="en-US"/>
+        </w:rPr>
+        <w:t xml:space="preserve"> Alpha di Dashboard E</w:t>
       </w:r>
       <w:r>
         <w:rPr>
@@ -181,12 +815,14 @@
         </w:rPr>
         <w:t>-</w:t>
       </w:r>
+      <w:proofErr w:type="spellStart"/>
       <w:r>
         <w:rPr>
           <w:lang w:val="en-US"/>
         </w:rPr>
         <w:t>Absensi</w:t>
       </w:r>
+      <w:proofErr w:type="spellEnd"/>
     </w:p>
     <w:p>
       <w:pPr>
@@ -206,12 +842,42 @@
           <w:lang w:val="en-US"/>
         </w:rPr>
       </w:pPr>
-      <w:r>
-        <w:rPr>
-          <w:lang w:val="en-US"/>
-        </w:rPr>
-        <w:t>Grafik di profil karyawan</w:t>
-      </w:r>
+      <w:proofErr w:type="spellStart"/>
+      <w:r>
+        <w:rPr>
+          <w:lang w:val="en-US"/>
+        </w:rPr>
+        <w:t>Grafik</w:t>
+      </w:r>
+      <w:proofErr w:type="spellEnd"/>
+      <w:r>
+        <w:rPr>
+          <w:lang w:val="en-US"/>
+        </w:rPr>
+        <w:t xml:space="preserve"> di </w:t>
+      </w:r>
+      <w:proofErr w:type="spellStart"/>
+      <w:r>
+        <w:rPr>
+          <w:lang w:val="en-US"/>
+        </w:rPr>
+        <w:t>profil</w:t>
+      </w:r>
+      <w:proofErr w:type="spellEnd"/>
+      <w:r>
+        <w:rPr>
+          <w:lang w:val="en-US"/>
+        </w:rPr>
+        <w:t xml:space="preserve"> </w:t>
+      </w:r>
+      <w:proofErr w:type="spellStart"/>
+      <w:r>
+        <w:rPr>
+          <w:lang w:val="en-US"/>
+        </w:rPr>
+        <w:t>karyawan</w:t>
+      </w:r>
+      <w:proofErr w:type="spellEnd"/>
       <w:r>
         <w:rPr>
           <w:lang w:val="en-US"/>
@@ -234,7 +900,35 @@
         <w:rPr>
           <w:lang w:val="en-US"/>
         </w:rPr>
-        <w:t>Jenis (Medis / Non Medis)</w:t>
+        <w:t>Jenis (</w:t>
+      </w:r>
+      <w:proofErr w:type="spellStart"/>
+      <w:r>
+        <w:rPr>
+          <w:lang w:val="en-US"/>
+        </w:rPr>
+        <w:t>Medis</w:t>
+      </w:r>
+      <w:proofErr w:type="spellEnd"/>
+      <w:r>
+        <w:rPr>
+          <w:lang w:val="en-US"/>
+        </w:rPr>
+        <w:t xml:space="preserve"> / Non </w:t>
+      </w:r>
+      <w:proofErr w:type="spellStart"/>
+      <w:r>
+        <w:rPr>
+          <w:lang w:val="en-US"/>
+        </w:rPr>
+        <w:t>Medis</w:t>
+      </w:r>
+      <w:proofErr w:type="spellEnd"/>
+      <w:r>
+        <w:rPr>
+          <w:lang w:val="en-US"/>
+        </w:rPr>
+        <w:t>)</w:t>
       </w:r>
     </w:p>
     <w:p>
@@ -284,12 +978,14 @@
           <w:lang w:val="en-US"/>
         </w:rPr>
       </w:pPr>
+      <w:proofErr w:type="spellStart"/>
       <w:r>
         <w:rPr>
           <w:lang w:val="en-US"/>
         </w:rPr>
         <w:t>Profesi</w:t>
       </w:r>
+      <w:proofErr w:type="spellEnd"/>
     </w:p>
     <w:p>
       <w:pPr>
@@ -306,8 +1002,16 @@
         <w:rPr>
           <w:lang w:val="en-US"/>
         </w:rPr>
-        <w:t>Status pegawai</w:t>
-      </w:r>
+        <w:t xml:space="preserve">Status </w:t>
+      </w:r>
+      <w:proofErr w:type="spellStart"/>
+      <w:r>
+        <w:rPr>
+          <w:lang w:val="en-US"/>
+        </w:rPr>
+        <w:t>pegawai</w:t>
+      </w:r>
+      <w:proofErr w:type="spellEnd"/>
     </w:p>
     <w:p>
       <w:pPr>
@@ -324,7 +1028,63 @@
         <w:rPr>
           <w:lang w:val="en-US"/>
         </w:rPr>
-        <w:t>Status pegawai di penetapan ditambah “Meninggal”</w:t>
+        <w:t xml:space="preserve">Status </w:t>
+      </w:r>
+      <w:proofErr w:type="spellStart"/>
+      <w:r>
+        <w:rPr>
+          <w:lang w:val="en-US"/>
+        </w:rPr>
+        <w:t>pegawai</w:t>
+      </w:r>
+      <w:proofErr w:type="spellEnd"/>
+      <w:r>
+        <w:rPr>
+          <w:lang w:val="en-US"/>
+        </w:rPr>
+        <w:t xml:space="preserve"> di </w:t>
+      </w:r>
+      <w:proofErr w:type="spellStart"/>
+      <w:r>
+        <w:rPr>
+          <w:lang w:val="en-US"/>
+        </w:rPr>
+        <w:t>penetapan</w:t>
+      </w:r>
+      <w:proofErr w:type="spellEnd"/>
+      <w:r>
+        <w:rPr>
+          <w:lang w:val="en-US"/>
+        </w:rPr>
+        <w:t xml:space="preserve"> </w:t>
+      </w:r>
+      <w:proofErr w:type="spellStart"/>
+      <w:r>
+        <w:rPr>
+          <w:lang w:val="en-US"/>
+        </w:rPr>
+        <w:t>ditambah</w:t>
+      </w:r>
+      <w:proofErr w:type="spellEnd"/>
+      <w:r>
+        <w:rPr>
+          <w:lang w:val="en-US"/>
+        </w:rPr>
+        <w:t xml:space="preserve"> “</w:t>
+      </w:r>
+      <w:proofErr w:type="spellStart"/>
+      <w:r>
+        <w:rPr>
+          <w:lang w:val="en-US"/>
+        </w:rPr>
+        <w:t>Meninggal</w:t>
+      </w:r>
+      <w:proofErr w:type="spellEnd"/>
+      <w:r>
+        <w:rPr>
+          <w:lang w:val="en-US"/>
+        </w:rPr>
+        <w:t>”</w:t>
       </w:r>
     </w:p>
     <w:p>
@@ -338,11 +1098,103 @@
           <w:lang w:val="en-US"/>
         </w:rPr>
       </w:pPr>
-      <w:r>
-        <w:rPr>
-          <w:lang w:val="en-US"/>
-        </w:rPr>
-        <w:t>Tambah filter di profil kepegawaian (pencarian karyawan berdasarkan status penetapan)</w:t>
+      <w:proofErr w:type="spellStart"/>
+      <w:r>
+        <w:rPr>
+          <w:lang w:val="en-US"/>
+        </w:rPr>
+        <w:t>Tambah</w:t>
+      </w:r>
+      <w:proofErr w:type="spellEnd"/>
+      <w:r>
+        <w:rPr>
+          <w:lang w:val="en-US"/>
+        </w:rPr>
+        <w:t xml:space="preserve"> filter di </w:t>
+      </w:r>
+      <w:proofErr w:type="spellStart"/>
+      <w:r>
+        <w:rPr>
+          <w:lang w:val="en-US"/>
+        </w:rPr>
+        <w:t>profil</w:t>
+      </w:r>
+      <w:proofErr w:type="spellEnd"/>
+      <w:r>
+        <w:rPr>
+          <w:lang w:val="en-US"/>
+        </w:rPr>
+        <w:t xml:space="preserve"> </w:t>
+      </w:r>
+      <w:proofErr w:type="spellStart"/>
+      <w:r>
+        <w:rPr>
+          <w:lang w:val="en-US"/>
+        </w:rPr>
+        <w:t>kepegawaian</w:t>
+      </w:r>
+      <w:proofErr w:type="spellEnd"/>
+      <w:r>
+        <w:rPr>
+          <w:lang w:val="en-US"/>
+        </w:rPr>
+        <w:t xml:space="preserve"> (</w:t>
+      </w:r>
+      <w:proofErr w:type="spellStart"/>
+      <w:r>
+        <w:rPr>
+          <w:lang w:val="en-US"/>
+        </w:rPr>
+        <w:t>pencarian</w:t>
+      </w:r>
+      <w:proofErr w:type="spellEnd"/>
+      <w:r>
+        <w:rPr>
+          <w:lang w:val="en-US"/>
+        </w:rPr>
+        <w:t xml:space="preserve"> </w:t>
+      </w:r>
+      <w:proofErr w:type="spellStart"/>
+      <w:r>
+        <w:rPr>
+          <w:lang w:val="en-US"/>
+        </w:rPr>
+        <w:t>karyawan</w:t>
+      </w:r>
+      <w:proofErr w:type="spellEnd"/>
+      <w:r>
+        <w:rPr>
+          <w:lang w:val="en-US"/>
+        </w:rPr>
+        <w:t xml:space="preserve"> </w:t>
+      </w:r>
+      <w:proofErr w:type="spellStart"/>
+      <w:r>
+        <w:rPr>
+          <w:lang w:val="en-US"/>
+        </w:rPr>
+        <w:t>berdasarkan</w:t>
+      </w:r>
+      <w:proofErr w:type="spellEnd"/>
+      <w:r>
+        <w:rPr>
+          <w:lang w:val="en-US"/>
+        </w:rPr>
+        <w:t xml:space="preserve"> status </w:t>
+      </w:r>
+      <w:proofErr w:type="spellStart"/>
+      <w:r>
+        <w:rPr>
+          <w:lang w:val="en-US"/>
+        </w:rPr>
+        <w:t>penetapan</w:t>
+      </w:r>
+      <w:proofErr w:type="spellEnd"/>
+      <w:r>
+        <w:rPr>
+          <w:lang w:val="en-US"/>
+        </w:rPr>
+        <w:t>)</w:t>
       </w:r>
     </w:p>
     <w:p>

</xml_diff>

<commit_message>
update ref project kepegawaian
word
</commit_message>
<xml_diff>
--- a/project/kepegawaian/Evaluasi Absensi 11 Apr.docx
+++ b/project/kepegawaian/Evaluasi Absensi 11 Apr.docx
@@ -1021,11 +1021,13 @@
           <w:numId w:val="3"/>
         </w:numPr>
         <w:rPr>
-          <w:lang w:val="en-US"/>
-        </w:rPr>
-      </w:pPr>
-      <w:r>
-        <w:rPr>
+          <w:strike/>
+          <w:lang w:val="en-US"/>
+        </w:rPr>
+      </w:pPr>
+      <w:r>
+        <w:rPr>
+          <w:strike/>
           <w:lang w:val="en-US"/>
         </w:rPr>
         <w:t xml:space="preserve">Status </w:t>
@@ -1033,6 +1035,7 @@
       <w:proofErr w:type="spellStart"/>
       <w:r>
         <w:rPr>
+          <w:strike/>
           <w:lang w:val="en-US"/>
         </w:rPr>
         <w:t>pegawai</w:t>
@@ -1040,6 +1043,7 @@
       <w:proofErr w:type="spellEnd"/>
       <w:r>
         <w:rPr>
+          <w:strike/>
           <w:lang w:val="en-US"/>
         </w:rPr>
         <w:t xml:space="preserve"> di </w:t>
@@ -1047,6 +1051,7 @@
       <w:proofErr w:type="spellStart"/>
       <w:r>
         <w:rPr>
+          <w:strike/>
           <w:lang w:val="en-US"/>
         </w:rPr>
         <w:t>penetapan</w:t>
@@ -1054,13 +1059,15 @@
       <w:proofErr w:type="spellEnd"/>
       <w:r>
         <w:rPr>
-          <w:lang w:val="en-US"/>
-        </w:rPr>
-        <w:t xml:space="preserve"> </w:t>
-      </w:r>
-      <w:proofErr w:type="spellStart"/>
-      <w:r>
-        <w:rPr>
+          <w:strike/>
+          <w:lang w:val="en-US"/>
+        </w:rPr>
+        <w:t xml:space="preserve"> </w:t>
+      </w:r>
+      <w:proofErr w:type="spellStart"/>
+      <w:r>
+        <w:rPr>
+          <w:strike/>
           <w:lang w:val="en-US"/>
         </w:rPr>
         <w:t>ditambah</w:t>
@@ -1068,6 +1075,7 @@
       <w:proofErr w:type="spellEnd"/>
       <w:r>
         <w:rPr>
+          <w:strike/>
           <w:lang w:val="en-US"/>
         </w:rPr>
         <w:t xml:space="preserve"> “</w:t>
@@ -1075,6 +1083,7 @@
       <w:proofErr w:type="spellStart"/>
       <w:r>
         <w:rPr>
+          <w:strike/>
           <w:lang w:val="en-US"/>
         </w:rPr>
         <w:t>Meninggal</w:t>
@@ -1082,6 +1091,7 @@
       <w:proofErr w:type="spellEnd"/>
       <w:r>
         <w:rPr>
+          <w:strike/>
           <w:lang w:val="en-US"/>
         </w:rPr>
         <w:t>”</w:t>

</xml_diff>

<commit_message>
evaluasi absensi 10 Mei
</commit_message>
<xml_diff>
--- a/project/kepegawaian/Evaluasi Absensi 11 Apr.docx
+++ b/project/kepegawaian/Evaluasi Absensi 11 Apr.docx
@@ -159,11 +159,19 @@
         </w:rPr>
         <w:t xml:space="preserve"> </w:t>
       </w:r>
-      <w:r>
-        <w:rPr>
-          <w:lang w:val="en-US"/>
-        </w:rPr>
-        <w:t xml:space="preserve">Laporan </w:t>
+      <w:proofErr w:type="spellStart"/>
+      <w:r>
+        <w:rPr>
+          <w:lang w:val="en-US"/>
+        </w:rPr>
+        <w:t>Laporan</w:t>
+      </w:r>
+      <w:proofErr w:type="spellEnd"/>
+      <w:r>
+        <w:rPr>
+          <w:lang w:val="en-US"/>
+        </w:rPr>
+        <w:t xml:space="preserve"> </w:t>
       </w:r>
       <w:proofErr w:type="spellStart"/>
       <w:r>
@@ -290,6 +298,12 @@
           <w:lang w:val="en-US"/>
         </w:rPr>
         <w:t xml:space="preserve"> %</w:t>
+      </w:r>
+      <w:r>
+        <w:rPr>
+          <w:lang w:val="en-US"/>
+        </w:rPr>
+        <w:t xml:space="preserve"> </w:t>
       </w:r>
     </w:p>
     <w:p>
@@ -308,14 +322,98 @@
         <w:rPr>
           <w:lang w:val="en-US"/>
         </w:rPr>
-        <w:t>Grafik</w:t>
-      </w:r>
-      <w:proofErr w:type="spellEnd"/>
-      <w:r>
-        <w:rPr>
-          <w:lang w:val="en-US"/>
-        </w:rPr>
-        <w:t xml:space="preserve"> </w:t>
+        <w:t>Ijin</w:t>
+      </w:r>
+      <w:proofErr w:type="spellEnd"/>
+      <w:r>
+        <w:rPr>
+          <w:lang w:val="en-US"/>
+        </w:rPr>
+        <w:t xml:space="preserve"> (</w:t>
+      </w:r>
+      <w:proofErr w:type="spellStart"/>
+      <w:r>
+        <w:rPr>
+          <w:lang w:val="en-US"/>
+        </w:rPr>
+        <w:t>keluarga</w:t>
+      </w:r>
+      <w:proofErr w:type="spellEnd"/>
+      <w:r>
+        <w:rPr>
+          <w:lang w:val="en-US"/>
+        </w:rPr>
+        <w:t xml:space="preserve"> </w:t>
+      </w:r>
+      <w:proofErr w:type="spellStart"/>
+      <w:r>
+        <w:rPr>
+          <w:lang w:val="en-US"/>
+        </w:rPr>
+        <w:t>meninggal</w:t>
+      </w:r>
+      <w:proofErr w:type="spellEnd"/>
+      <w:r>
+        <w:rPr>
+          <w:lang w:val="en-US"/>
+        </w:rPr>
+        <w:t xml:space="preserve">, </w:t>
+      </w:r>
+      <w:proofErr w:type="spellStart"/>
+      <w:r>
+        <w:rPr>
+          <w:lang w:val="en-US"/>
+        </w:rPr>
+        <w:t>menunggu</w:t>
+      </w:r>
+      <w:proofErr w:type="spellEnd"/>
+      <w:r>
+        <w:rPr>
+          <w:lang w:val="en-US"/>
+        </w:rPr>
+        <w:t xml:space="preserve"> </w:t>
+      </w:r>
+      <w:proofErr w:type="spellStart"/>
+      <w:r>
+        <w:rPr>
+          <w:lang w:val="en-US"/>
+        </w:rPr>
+        <w:t>suamiistri</w:t>
+      </w:r>
+      <w:proofErr w:type="spellEnd"/>
+      <w:r>
+        <w:rPr>
+          <w:lang w:val="en-US"/>
+        </w:rPr>
+        <w:t>/</w:t>
+      </w:r>
+      <w:proofErr w:type="spellStart"/>
+      <w:r>
+        <w:rPr>
+          <w:lang w:val="en-US"/>
+        </w:rPr>
+        <w:t>anak</w:t>
+      </w:r>
+      <w:proofErr w:type="spellEnd"/>
+      <w:r>
+        <w:rPr>
+          <w:lang w:val="en-US"/>
+        </w:rPr>
+        <w:t xml:space="preserve"> </w:t>
+      </w:r>
+      <w:proofErr w:type="spellStart"/>
+      <w:r>
+        <w:rPr>
+          <w:lang w:val="en-US"/>
+        </w:rPr>
+        <w:t>sakit</w:t>
+      </w:r>
+      <w:proofErr w:type="spellEnd"/>
+      <w:r>
+        <w:rPr>
+          <w:lang w:val="en-US"/>
+        </w:rPr>
+        <w:t>)</w:t>
       </w:r>
     </w:p>
     <w:p>
@@ -326,107 +424,170 @@
           <w:numId w:val="1"/>
         </w:numPr>
         <w:rPr>
-          <w:lang w:val="en-US"/>
-        </w:rPr>
-      </w:pPr>
-      <w:proofErr w:type="spellStart"/>
-      <w:r>
-        <w:rPr>
-          <w:lang w:val="en-US"/>
-        </w:rPr>
-        <w:t>Ijin</w:t>
-      </w:r>
-      <w:proofErr w:type="spellEnd"/>
-      <w:r>
-        <w:rPr>
-          <w:lang w:val="en-US"/>
-        </w:rPr>
-        <w:t xml:space="preserve"> (</w:t>
-      </w:r>
-      <w:proofErr w:type="spellStart"/>
-      <w:r>
-        <w:rPr>
-          <w:lang w:val="en-US"/>
-        </w:rPr>
-        <w:t>keluarga</w:t>
-      </w:r>
-      <w:proofErr w:type="spellEnd"/>
-      <w:r>
-        <w:rPr>
-          <w:lang w:val="en-US"/>
-        </w:rPr>
-        <w:t xml:space="preserve"> </w:t>
-      </w:r>
-      <w:proofErr w:type="spellStart"/>
-      <w:r>
-        <w:rPr>
-          <w:lang w:val="en-US"/>
-        </w:rPr>
-        <w:t>meninggal</w:t>
-      </w:r>
-      <w:proofErr w:type="spellEnd"/>
-      <w:r>
-        <w:rPr>
-          <w:lang w:val="en-US"/>
-        </w:rPr>
-        <w:t xml:space="preserve">, </w:t>
-      </w:r>
-      <w:proofErr w:type="spellStart"/>
-      <w:r>
-        <w:rPr>
-          <w:lang w:val="en-US"/>
-        </w:rPr>
-        <w:t>menunggu</w:t>
-      </w:r>
-      <w:proofErr w:type="spellEnd"/>
-      <w:r>
-        <w:rPr>
-          <w:lang w:val="en-US"/>
-        </w:rPr>
-        <w:t xml:space="preserve"> </w:t>
-      </w:r>
-      <w:proofErr w:type="spellStart"/>
-      <w:r>
-        <w:rPr>
-          <w:lang w:val="en-US"/>
-        </w:rPr>
-        <w:t>suamiistri</w:t>
-      </w:r>
-      <w:proofErr w:type="spellEnd"/>
-      <w:r>
-        <w:rPr>
-          <w:lang w:val="en-US"/>
-        </w:rPr>
-        <w:t>/</w:t>
-      </w:r>
-      <w:proofErr w:type="spellStart"/>
-      <w:r>
-        <w:rPr>
-          <w:lang w:val="en-US"/>
-        </w:rPr>
-        <w:t>anak</w:t>
-      </w:r>
-      <w:proofErr w:type="spellEnd"/>
-      <w:r>
-        <w:rPr>
-          <w:lang w:val="en-US"/>
-        </w:rPr>
-        <w:t xml:space="preserve"> </w:t>
-      </w:r>
-      <w:proofErr w:type="spellStart"/>
-      <w:r>
-        <w:rPr>
-          <w:lang w:val="en-US"/>
-        </w:rPr>
-        <w:t>sakit</w:t>
-      </w:r>
-      <w:proofErr w:type="spellEnd"/>
-      <w:r>
-        <w:rPr>
-          <w:lang w:val="en-US"/>
-        </w:rPr>
-        <w:t>)</w:t>
-      </w:r>
+          <w:strike/>
+          <w:lang w:val="en-US"/>
+        </w:rPr>
+      </w:pPr>
+      <w:r>
+        <w:rPr>
+          <w:strike/>
+          <w:lang w:val="en-US"/>
+        </w:rPr>
+        <w:t xml:space="preserve">Table </w:t>
+      </w:r>
+      <w:proofErr w:type="spellStart"/>
+      <w:r>
+        <w:rPr>
+          <w:strike/>
+          <w:lang w:val="en-US"/>
+        </w:rPr>
+        <w:t>riwayat</w:t>
+      </w:r>
+      <w:proofErr w:type="spellEnd"/>
+      <w:r>
+        <w:rPr>
+          <w:strike/>
+          <w:lang w:val="en-US"/>
+        </w:rPr>
+        <w:t xml:space="preserve"> = Filter </w:t>
+      </w:r>
+      <w:proofErr w:type="spellStart"/>
+      <w:r>
+        <w:rPr>
+          <w:strike/>
+          <w:lang w:val="en-US"/>
+        </w:rPr>
+        <w:t>ditambah</w:t>
+      </w:r>
+      <w:proofErr w:type="spellEnd"/>
+      <w:r>
+        <w:rPr>
+          <w:strike/>
+          <w:lang w:val="en-US"/>
+        </w:rPr>
+        <w:t xml:space="preserve"> </w:t>
+      </w:r>
+      <w:proofErr w:type="spellStart"/>
+      <w:r>
+        <w:rPr>
+          <w:strike/>
+          <w:lang w:val="en-US"/>
+        </w:rPr>
+        <w:t>nama</w:t>
+      </w:r>
+      <w:proofErr w:type="spellEnd"/>
+      <w:r>
+        <w:rPr>
+          <w:strike/>
+          <w:lang w:val="en-US"/>
+        </w:rPr>
+        <w:t xml:space="preserve"> </w:t>
+      </w:r>
+      <w:proofErr w:type="spellStart"/>
+      <w:r>
+        <w:rPr>
+          <w:strike/>
+          <w:lang w:val="en-US"/>
+        </w:rPr>
+        <w:t>pegawai</w:t>
+      </w:r>
+      <w:proofErr w:type="spellEnd"/>
+      <w:r>
+        <w:rPr>
+          <w:strike/>
+          <w:lang w:val="en-US"/>
+        </w:rPr>
+        <w:t xml:space="preserve"> (data </w:t>
+      </w:r>
+      <w:proofErr w:type="spellStart"/>
+      <w:r>
+        <w:rPr>
+          <w:strike/>
+          <w:lang w:val="en-US"/>
+        </w:rPr>
+        <w:t>absen</w:t>
+      </w:r>
+      <w:proofErr w:type="spellEnd"/>
+      <w:r>
+        <w:rPr>
+          <w:strike/>
+          <w:lang w:val="en-US"/>
+        </w:rPr>
+        <w:t xml:space="preserve"> </w:t>
+      </w:r>
+      <w:proofErr w:type="spellStart"/>
+      <w:r>
+        <w:rPr>
+          <w:strike/>
+          <w:lang w:val="en-US"/>
+        </w:rPr>
+        <w:t>tgl</w:t>
+      </w:r>
+      <w:proofErr w:type="spellEnd"/>
+      <w:r>
+        <w:rPr>
+          <w:strike/>
+          <w:lang w:val="en-US"/>
+        </w:rPr>
+        <w:t xml:space="preserve"> 21-20) </w:t>
+      </w:r>
+      <w:proofErr w:type="spellStart"/>
+      <w:r>
+        <w:rPr>
+          <w:strike/>
+          <w:lang w:val="en-US"/>
+        </w:rPr>
+        <w:t>terkait</w:t>
+      </w:r>
+      <w:proofErr w:type="spellEnd"/>
+      <w:r>
+        <w:rPr>
+          <w:strike/>
+          <w:lang w:val="en-US"/>
+        </w:rPr>
+        <w:t xml:space="preserve"> </w:t>
+      </w:r>
+      <w:proofErr w:type="spellStart"/>
+      <w:r>
+        <w:rPr>
+          <w:strike/>
+          <w:lang w:val="en-US"/>
+        </w:rPr>
+        <w:t>penghitungan</w:t>
+      </w:r>
+      <w:proofErr w:type="spellEnd"/>
+      <w:r>
+        <w:rPr>
+          <w:strike/>
+          <w:lang w:val="en-US"/>
+        </w:rPr>
+        <w:t xml:space="preserve"> </w:t>
+      </w:r>
+      <w:proofErr w:type="spellStart"/>
+      <w:r>
+        <w:rPr>
+          <w:strike/>
+          <w:lang w:val="en-US"/>
+        </w:rPr>
+        <w:t>insentif</w:t>
+      </w:r>
+      <w:proofErr w:type="spellEnd"/>
+      <w:r>
+        <w:rPr>
+          <w:strike/>
+          <w:lang w:val="en-US"/>
+        </w:rPr>
+        <w:t xml:space="preserve"> </w:t>
+      </w:r>
+      <w:proofErr w:type="spellStart"/>
+      <w:r>
+        <w:rPr>
+          <w:strike/>
+          <w:lang w:val="en-US"/>
+        </w:rPr>
+        <w:t>kehadiran</w:t>
+      </w:r>
+      <w:proofErr w:type="spellEnd"/>
     </w:p>
     <w:p>
       <w:pPr>
@@ -440,60 +601,21 @@
           <w:lang w:val="en-US"/>
         </w:rPr>
       </w:pPr>
-      <w:r>
-        <w:rPr>
-          <w:strike/>
-          <w:lang w:val="en-US"/>
-        </w:rPr>
-        <w:t xml:space="preserve">Table </w:t>
-      </w:r>
-      <w:proofErr w:type="spellStart"/>
-      <w:r>
-        <w:rPr>
-          <w:strike/>
-          <w:lang w:val="en-US"/>
-        </w:rPr>
-        <w:t>riwayat</w:t>
-      </w:r>
-      <w:proofErr w:type="spellEnd"/>
-      <w:r>
-        <w:rPr>
-          <w:strike/>
-          <w:lang w:val="en-US"/>
-        </w:rPr>
-        <w:t xml:space="preserve"> = Filter </w:t>
-      </w:r>
-      <w:proofErr w:type="spellStart"/>
-      <w:r>
-        <w:rPr>
-          <w:strike/>
-          <w:lang w:val="en-US"/>
-        </w:rPr>
-        <w:t>ditambah</w:t>
-      </w:r>
-      <w:proofErr w:type="spellEnd"/>
-      <w:r>
-        <w:rPr>
-          <w:strike/>
-          <w:lang w:val="en-US"/>
-        </w:rPr>
-        <w:t xml:space="preserve"> nama </w:t>
-      </w:r>
-      <w:proofErr w:type="spellStart"/>
-      <w:r>
-        <w:rPr>
-          <w:strike/>
-          <w:lang w:val="en-US"/>
-        </w:rPr>
-        <w:t>pegawai</w:t>
-      </w:r>
-      <w:proofErr w:type="spellEnd"/>
-      <w:r>
-        <w:rPr>
-          <w:strike/>
-          <w:lang w:val="en-US"/>
-        </w:rPr>
-        <w:t xml:space="preserve"> (data </w:t>
+      <w:proofErr w:type="spellStart"/>
+      <w:r>
+        <w:rPr>
+          <w:strike/>
+          <w:lang w:val="en-US"/>
+        </w:rPr>
+        <w:t>Maksimal</w:t>
+      </w:r>
+      <w:proofErr w:type="spellEnd"/>
+      <w:r>
+        <w:rPr>
+          <w:strike/>
+          <w:lang w:val="en-US"/>
+        </w:rPr>
+        <w:t xml:space="preserve"> </w:t>
       </w:r>
       <w:proofErr w:type="spellStart"/>
       <w:r>
@@ -517,73 +639,16 @@
           <w:strike/>
           <w:lang w:val="en-US"/>
         </w:rPr>
-        <w:t>tgl</w:t>
-      </w:r>
-      <w:proofErr w:type="spellEnd"/>
-      <w:r>
-        <w:rPr>
-          <w:strike/>
-          <w:lang w:val="en-US"/>
-        </w:rPr>
-        <w:t xml:space="preserve"> 21-20) </w:t>
-      </w:r>
-      <w:proofErr w:type="spellStart"/>
-      <w:r>
-        <w:rPr>
-          <w:strike/>
-          <w:lang w:val="en-US"/>
-        </w:rPr>
-        <w:t>terkait</w:t>
-      </w:r>
-      <w:proofErr w:type="spellEnd"/>
-      <w:r>
-        <w:rPr>
-          <w:strike/>
-          <w:lang w:val="en-US"/>
-        </w:rPr>
-        <w:t xml:space="preserve"> </w:t>
-      </w:r>
-      <w:proofErr w:type="spellStart"/>
-      <w:r>
-        <w:rPr>
-          <w:strike/>
-          <w:lang w:val="en-US"/>
-        </w:rPr>
-        <w:t>penghitungan</w:t>
-      </w:r>
-      <w:proofErr w:type="spellEnd"/>
-      <w:r>
-        <w:rPr>
-          <w:strike/>
-          <w:lang w:val="en-US"/>
-        </w:rPr>
-        <w:t xml:space="preserve"> </w:t>
-      </w:r>
-      <w:proofErr w:type="spellStart"/>
-      <w:r>
-        <w:rPr>
-          <w:strike/>
-          <w:lang w:val="en-US"/>
-        </w:rPr>
-        <w:t>insentif</w:t>
-      </w:r>
-      <w:proofErr w:type="spellEnd"/>
-      <w:r>
-        <w:rPr>
-          <w:strike/>
-          <w:lang w:val="en-US"/>
-        </w:rPr>
-        <w:t xml:space="preserve"> </w:t>
-      </w:r>
-      <w:proofErr w:type="spellStart"/>
-      <w:r>
-        <w:rPr>
-          <w:strike/>
-          <w:lang w:val="en-US"/>
-        </w:rPr>
-        <w:t>kehadiran</w:t>
-      </w:r>
-      <w:proofErr w:type="spellEnd"/>
+        <w:t>pulang</w:t>
+      </w:r>
+      <w:proofErr w:type="spellEnd"/>
+      <w:r>
+        <w:rPr>
+          <w:strike/>
+          <w:lang w:val="en-US"/>
+        </w:rPr>
+        <w:t xml:space="preserve"> +2 jam</w:t>
+      </w:r>
     </w:p>
     <w:p>
       <w:pPr>
@@ -593,30 +658,68 @@
           <w:numId w:val="1"/>
         </w:numPr>
         <w:rPr>
-          <w:strike/>
-          <w:lang w:val="en-US"/>
-        </w:rPr>
-      </w:pPr>
-      <w:proofErr w:type="spellStart"/>
-      <w:r>
-        <w:rPr>
-          <w:strike/>
-          <w:lang w:val="en-US"/>
-        </w:rPr>
-        <w:t>Maksimal</w:t>
-      </w:r>
-      <w:proofErr w:type="spellEnd"/>
-      <w:r>
-        <w:rPr>
-          <w:strike/>
-          <w:lang w:val="en-US"/>
-        </w:rPr>
-        <w:t xml:space="preserve"> </w:t>
-      </w:r>
-      <w:proofErr w:type="spellStart"/>
-      <w:r>
-        <w:rPr>
-          <w:strike/>
+          <w:lang w:val="en-US"/>
+        </w:rPr>
+      </w:pPr>
+      <w:proofErr w:type="spellStart"/>
+      <w:r>
+        <w:rPr>
+          <w:lang w:val="en-US"/>
+        </w:rPr>
+        <w:t>Apabila</w:t>
+      </w:r>
+      <w:proofErr w:type="spellEnd"/>
+      <w:r>
+        <w:rPr>
+          <w:lang w:val="en-US"/>
+        </w:rPr>
+        <w:t xml:space="preserve"> di </w:t>
+      </w:r>
+      <w:proofErr w:type="spellStart"/>
+      <w:r>
+        <w:rPr>
+          <w:lang w:val="en-US"/>
+        </w:rPr>
+        <w:t>hari</w:t>
+      </w:r>
+      <w:proofErr w:type="spellEnd"/>
+      <w:r>
+        <w:rPr>
+          <w:lang w:val="en-US"/>
+        </w:rPr>
+        <w:t xml:space="preserve"> </w:t>
+      </w:r>
+      <w:proofErr w:type="spellStart"/>
+      <w:r>
+        <w:rPr>
+          <w:lang w:val="en-US"/>
+        </w:rPr>
+        <w:t>tsb</w:t>
+      </w:r>
+      <w:proofErr w:type="spellEnd"/>
+      <w:r>
+        <w:rPr>
+          <w:lang w:val="en-US"/>
+        </w:rPr>
+        <w:t xml:space="preserve"> </w:t>
+      </w:r>
+      <w:proofErr w:type="spellStart"/>
+      <w:r>
+        <w:rPr>
+          <w:lang w:val="en-US"/>
+        </w:rPr>
+        <w:t>tidak</w:t>
+      </w:r>
+      <w:proofErr w:type="spellEnd"/>
+      <w:r>
+        <w:rPr>
+          <w:lang w:val="en-US"/>
+        </w:rPr>
+        <w:t xml:space="preserve"> </w:t>
+      </w:r>
+      <w:proofErr w:type="spellStart"/>
+      <w:r>
+        <w:rPr>
           <w:lang w:val="en-US"/>
         </w:rPr>
         <w:t>absen</w:t>
@@ -624,15 +727,27 @@
       <w:proofErr w:type="spellEnd"/>
       <w:r>
         <w:rPr>
-          <w:strike/>
-          <w:lang w:val="en-US"/>
-        </w:rPr>
-        <w:t xml:space="preserve"> </w:t>
-      </w:r>
-      <w:proofErr w:type="spellStart"/>
-      <w:r>
-        <w:rPr>
-          <w:strike/>
+          <w:lang w:val="en-US"/>
+        </w:rPr>
+        <w:t xml:space="preserve"> </w:t>
+      </w:r>
+      <w:proofErr w:type="spellStart"/>
+      <w:r>
+        <w:rPr>
+          <w:lang w:val="en-US"/>
+        </w:rPr>
+        <w:t>masuk</w:t>
+      </w:r>
+      <w:proofErr w:type="spellEnd"/>
+      <w:r>
+        <w:rPr>
+          <w:lang w:val="en-US"/>
+        </w:rPr>
+        <w:t xml:space="preserve"> &amp; </w:t>
+      </w:r>
+      <w:proofErr w:type="spellStart"/>
+      <w:r>
+        <w:rPr>
           <w:lang w:val="en-US"/>
         </w:rPr>
         <w:t>pulang</w:t>
@@ -640,10 +755,9 @@
       <w:proofErr w:type="spellEnd"/>
       <w:r>
         <w:rPr>
-          <w:strike/>
-          <w:lang w:val="en-US"/>
-        </w:rPr>
-        <w:t xml:space="preserve"> +2 jam</w:t>
+          <w:lang w:val="en-US"/>
+        </w:rPr>
+        <w:t xml:space="preserve"> (ALPHA)</w:t>
       </w:r>
     </w:p>
     <w:p>
@@ -662,7 +776,82 @@
         <w:rPr>
           <w:lang w:val="en-US"/>
         </w:rPr>
-        <w:t>Apabila</w:t>
+        <w:t>Tambah</w:t>
+      </w:r>
+      <w:proofErr w:type="spellEnd"/>
+      <w:r>
+        <w:rPr>
+          <w:lang w:val="en-US"/>
+        </w:rPr>
+        <w:t xml:space="preserve"> </w:t>
+      </w:r>
+      <w:proofErr w:type="spellStart"/>
+      <w:r>
+        <w:rPr>
+          <w:lang w:val="en-US"/>
+        </w:rPr>
+        <w:t>keterangan</w:t>
+      </w:r>
+      <w:proofErr w:type="spellEnd"/>
+      <w:r>
+        <w:rPr>
+          <w:lang w:val="en-US"/>
+        </w:rPr>
+        <w:t xml:space="preserve"> </w:t>
+      </w:r>
+      <w:proofErr w:type="spellStart"/>
+      <w:r>
+        <w:rPr>
+          <w:lang w:val="en-US"/>
+        </w:rPr>
+        <w:t>juml</w:t>
+      </w:r>
+      <w:proofErr w:type="spellEnd"/>
+      <w:r>
+        <w:rPr>
+          <w:lang w:val="en-US"/>
+        </w:rPr>
+        <w:t xml:space="preserve"> Alpha di Dashboard E</w:t>
+      </w:r>
+      <w:r>
+        <w:rPr>
+          <w:lang w:val="en-US"/>
+        </w:rPr>
+        <w:t>-</w:t>
+      </w:r>
+      <w:proofErr w:type="spellStart"/>
+      <w:r>
+        <w:rPr>
+          <w:lang w:val="en-US"/>
+        </w:rPr>
+        <w:t>Absensi</w:t>
+      </w:r>
+      <w:proofErr w:type="spellEnd"/>
+    </w:p>
+    <w:p>
+      <w:pPr>
+        <w:rPr>
+          <w:lang w:val="en-US"/>
+        </w:rPr>
+      </w:pPr>
+    </w:p>
+    <w:p>
+      <w:pPr>
+        <w:pStyle w:val="ListParagraph"/>
+        <w:numPr>
+          <w:ilvl w:val="0"/>
+          <w:numId w:val="3"/>
+        </w:numPr>
+        <w:rPr>
+          <w:lang w:val="en-US"/>
+        </w:rPr>
+      </w:pPr>
+      <w:proofErr w:type="spellStart"/>
+      <w:r>
+        <w:rPr>
+          <w:lang w:val="en-US"/>
+        </w:rPr>
+        <w:t>Grafik</w:t>
       </w:r>
       <w:proofErr w:type="spellEnd"/>
       <w:r>
@@ -676,84 +865,379 @@
         <w:rPr>
           <w:lang w:val="en-US"/>
         </w:rPr>
-        <w:t>hari</w:t>
-      </w:r>
-      <w:proofErr w:type="spellEnd"/>
-      <w:r>
-        <w:rPr>
-          <w:lang w:val="en-US"/>
-        </w:rPr>
-        <w:t xml:space="preserve"> </w:t>
-      </w:r>
-      <w:proofErr w:type="spellStart"/>
-      <w:r>
-        <w:rPr>
-          <w:lang w:val="en-US"/>
-        </w:rPr>
-        <w:t>tsb</w:t>
-      </w:r>
-      <w:proofErr w:type="spellEnd"/>
-      <w:r>
-        <w:rPr>
-          <w:lang w:val="en-US"/>
-        </w:rPr>
-        <w:t xml:space="preserve"> </w:t>
-      </w:r>
-      <w:proofErr w:type="spellStart"/>
-      <w:r>
-        <w:rPr>
-          <w:lang w:val="en-US"/>
-        </w:rPr>
-        <w:t>tidak</w:t>
-      </w:r>
-      <w:proofErr w:type="spellEnd"/>
-      <w:r>
-        <w:rPr>
-          <w:lang w:val="en-US"/>
-        </w:rPr>
-        <w:t xml:space="preserve"> </w:t>
-      </w:r>
-      <w:proofErr w:type="spellStart"/>
-      <w:r>
-        <w:rPr>
-          <w:lang w:val="en-US"/>
-        </w:rPr>
-        <w:t>absen</w:t>
-      </w:r>
-      <w:proofErr w:type="spellEnd"/>
-      <w:r>
-        <w:rPr>
-          <w:lang w:val="en-US"/>
-        </w:rPr>
-        <w:t xml:space="preserve"> </w:t>
-      </w:r>
-      <w:proofErr w:type="spellStart"/>
-      <w:r>
-        <w:rPr>
-          <w:lang w:val="en-US"/>
-        </w:rPr>
-        <w:t>masuk</w:t>
-      </w:r>
-      <w:proofErr w:type="spellEnd"/>
-      <w:r>
-        <w:rPr>
-          <w:lang w:val="en-US"/>
-        </w:rPr>
-        <w:t xml:space="preserve"> &amp; </w:t>
-      </w:r>
-      <w:proofErr w:type="spellStart"/>
-      <w:r>
-        <w:rPr>
-          <w:lang w:val="en-US"/>
-        </w:rPr>
-        <w:t>pulang</w:t>
-      </w:r>
-      <w:proofErr w:type="spellEnd"/>
-      <w:r>
-        <w:rPr>
-          <w:lang w:val="en-US"/>
-        </w:rPr>
-        <w:t xml:space="preserve"> (ALPHA)</w:t>
+        <w:t>profil</w:t>
+      </w:r>
+      <w:proofErr w:type="spellEnd"/>
+      <w:r>
+        <w:rPr>
+          <w:lang w:val="en-US"/>
+        </w:rPr>
+        <w:t xml:space="preserve"> </w:t>
+      </w:r>
+      <w:proofErr w:type="spellStart"/>
+      <w:r>
+        <w:rPr>
+          <w:lang w:val="en-US"/>
+        </w:rPr>
+        <w:t>karyawan</w:t>
+      </w:r>
+      <w:proofErr w:type="spellEnd"/>
+      <w:r>
+        <w:rPr>
+          <w:lang w:val="en-US"/>
+        </w:rPr>
+        <w:t xml:space="preserve">: </w:t>
+      </w:r>
+    </w:p>
+    <w:p>
+      <w:pPr>
+        <w:pStyle w:val="ListParagraph"/>
+        <w:numPr>
+          <w:ilvl w:val="1"/>
+          <w:numId w:val="3"/>
+        </w:numPr>
+        <w:rPr>
+          <w:lang w:val="en-US"/>
+        </w:rPr>
+      </w:pPr>
+      <w:proofErr w:type="spellStart"/>
+      <w:r>
+        <w:rPr>
+          <w:lang w:val="en-US"/>
+        </w:rPr>
+        <w:t>Jenis</w:t>
+      </w:r>
+      <w:proofErr w:type="spellEnd"/>
+      <w:r>
+        <w:rPr>
+          <w:lang w:val="en-US"/>
+        </w:rPr>
+        <w:t xml:space="preserve"> (</w:t>
+      </w:r>
+      <w:proofErr w:type="spellStart"/>
+      <w:r>
+        <w:rPr>
+          <w:lang w:val="en-US"/>
+        </w:rPr>
+        <w:t>Medis</w:t>
+      </w:r>
+      <w:proofErr w:type="spellEnd"/>
+      <w:r>
+        <w:rPr>
+          <w:lang w:val="en-US"/>
+        </w:rPr>
+        <w:t xml:space="preserve"> / Non </w:t>
+      </w:r>
+      <w:proofErr w:type="spellStart"/>
+      <w:r>
+        <w:rPr>
+          <w:lang w:val="en-US"/>
+        </w:rPr>
+        <w:t>Medis</w:t>
+      </w:r>
+      <w:proofErr w:type="spellEnd"/>
+      <w:r>
+        <w:rPr>
+          <w:lang w:val="en-US"/>
+        </w:rPr>
+        <w:t>)</w:t>
+      </w:r>
+    </w:p>
+    <w:p>
+      <w:pPr>
+        <w:pStyle w:val="ListParagraph"/>
+        <w:numPr>
+          <w:ilvl w:val="1"/>
+          <w:numId w:val="3"/>
+        </w:numPr>
+        <w:rPr>
+          <w:lang w:val="en-US"/>
+        </w:rPr>
+      </w:pPr>
+      <w:r>
+        <w:rPr>
+          <w:lang w:val="en-US"/>
+        </w:rPr>
+        <w:t>Jenis Kelamin</w:t>
+      </w:r>
+    </w:p>
+    <w:p>
+      <w:pPr>
+        <w:pStyle w:val="ListParagraph"/>
+        <w:numPr>
+          <w:ilvl w:val="1"/>
+          <w:numId w:val="3"/>
+        </w:numPr>
+        <w:rPr>
+          <w:lang w:val="en-US"/>
+        </w:rPr>
+      </w:pPr>
+      <w:r>
+        <w:rPr>
+          <w:lang w:val="en-US"/>
+        </w:rPr>
+        <w:t>Pendidikan</w:t>
+      </w:r>
+    </w:p>
+    <w:p>
+      <w:pPr>
+        <w:pStyle w:val="ListParagraph"/>
+        <w:numPr>
+          <w:ilvl w:val="1"/>
+          <w:numId w:val="3"/>
+        </w:numPr>
+        <w:rPr>
+          <w:lang w:val="en-US"/>
+        </w:rPr>
+      </w:pPr>
+      <w:proofErr w:type="spellStart"/>
+      <w:r>
+        <w:rPr>
+          <w:lang w:val="en-US"/>
+        </w:rPr>
+        <w:t>Profesi</w:t>
+      </w:r>
+      <w:proofErr w:type="spellEnd"/>
+    </w:p>
+    <w:p>
+      <w:pPr>
+        <w:pStyle w:val="ListParagraph"/>
+        <w:numPr>
+          <w:ilvl w:val="1"/>
+          <w:numId w:val="3"/>
+        </w:numPr>
+        <w:rPr>
+          <w:lang w:val="en-US"/>
+        </w:rPr>
+      </w:pPr>
+      <w:r>
+        <w:rPr>
+          <w:lang w:val="en-US"/>
+        </w:rPr>
+        <w:t xml:space="preserve">Status </w:t>
+      </w:r>
+      <w:proofErr w:type="spellStart"/>
+      <w:r>
+        <w:rPr>
+          <w:lang w:val="en-US"/>
+        </w:rPr>
+        <w:t>pegawai</w:t>
+      </w:r>
+      <w:proofErr w:type="spellEnd"/>
+    </w:p>
+    <w:p>
+      <w:pPr>
+        <w:pStyle w:val="ListParagraph"/>
+        <w:numPr>
+          <w:ilvl w:val="0"/>
+          <w:numId w:val="3"/>
+        </w:numPr>
+        <w:rPr>
+          <w:strike/>
+          <w:lang w:val="en-US"/>
+        </w:rPr>
+      </w:pPr>
+      <w:r>
+        <w:rPr>
+          <w:strike/>
+          <w:lang w:val="en-US"/>
+        </w:rPr>
+        <w:t xml:space="preserve">Status </w:t>
+      </w:r>
+      <w:proofErr w:type="spellStart"/>
+      <w:r>
+        <w:rPr>
+          <w:strike/>
+          <w:lang w:val="en-US"/>
+        </w:rPr>
+        <w:t>pegawai</w:t>
+      </w:r>
+      <w:proofErr w:type="spellEnd"/>
+      <w:r>
+        <w:rPr>
+          <w:strike/>
+          <w:lang w:val="en-US"/>
+        </w:rPr>
+        <w:t xml:space="preserve"> di </w:t>
+      </w:r>
+      <w:proofErr w:type="spellStart"/>
+      <w:r>
+        <w:rPr>
+          <w:strike/>
+          <w:lang w:val="en-US"/>
+        </w:rPr>
+        <w:t>penetapan</w:t>
+      </w:r>
+      <w:proofErr w:type="spellEnd"/>
+      <w:r>
+        <w:rPr>
+          <w:strike/>
+          <w:lang w:val="en-US"/>
+        </w:rPr>
+        <w:t xml:space="preserve"> </w:t>
+      </w:r>
+      <w:proofErr w:type="spellStart"/>
+      <w:r>
+        <w:rPr>
+          <w:strike/>
+          <w:lang w:val="en-US"/>
+        </w:rPr>
+        <w:t>ditambah</w:t>
+      </w:r>
+      <w:proofErr w:type="spellEnd"/>
+      <w:r>
+        <w:rPr>
+          <w:strike/>
+          <w:lang w:val="en-US"/>
+        </w:rPr>
+        <w:t xml:space="preserve"> “</w:t>
+      </w:r>
+      <w:proofErr w:type="spellStart"/>
+      <w:r>
+        <w:rPr>
+          <w:strike/>
+          <w:lang w:val="en-US"/>
+        </w:rPr>
+        <w:t>Meninggal</w:t>
+      </w:r>
+      <w:proofErr w:type="spellEnd"/>
+      <w:r>
+        <w:rPr>
+          <w:strike/>
+          <w:lang w:val="en-US"/>
+        </w:rPr>
+        <w:t>”</w:t>
+      </w:r>
+    </w:p>
+    <w:p>
+      <w:pPr>
+        <w:pStyle w:val="ListParagraph"/>
+        <w:numPr>
+          <w:ilvl w:val="0"/>
+          <w:numId w:val="3"/>
+        </w:numPr>
+        <w:rPr>
+          <w:lang w:val="en-US"/>
+        </w:rPr>
+      </w:pPr>
+      <w:proofErr w:type="spellStart"/>
+      <w:r>
+        <w:rPr>
+          <w:lang w:val="en-US"/>
+        </w:rPr>
+        <w:t>Tambah</w:t>
+      </w:r>
+      <w:proofErr w:type="spellEnd"/>
+      <w:r>
+        <w:rPr>
+          <w:lang w:val="en-US"/>
+        </w:rPr>
+        <w:t xml:space="preserve"> filter di </w:t>
+      </w:r>
+      <w:proofErr w:type="spellStart"/>
+      <w:r>
+        <w:rPr>
+          <w:lang w:val="en-US"/>
+        </w:rPr>
+        <w:t>profil</w:t>
+      </w:r>
+      <w:proofErr w:type="spellEnd"/>
+      <w:r>
+        <w:rPr>
+          <w:lang w:val="en-US"/>
+        </w:rPr>
+        <w:t xml:space="preserve"> </w:t>
+      </w:r>
+      <w:proofErr w:type="spellStart"/>
+      <w:r>
+        <w:rPr>
+          <w:lang w:val="en-US"/>
+        </w:rPr>
+        <w:t>kepegawaian</w:t>
+      </w:r>
+      <w:proofErr w:type="spellEnd"/>
+      <w:r>
+        <w:rPr>
+          <w:lang w:val="en-US"/>
+        </w:rPr>
+        <w:t xml:space="preserve"> (</w:t>
+      </w:r>
+      <w:proofErr w:type="spellStart"/>
+      <w:r>
+        <w:rPr>
+          <w:lang w:val="en-US"/>
+        </w:rPr>
+        <w:t>pencarian</w:t>
+      </w:r>
+      <w:proofErr w:type="spellEnd"/>
+      <w:r>
+        <w:rPr>
+          <w:lang w:val="en-US"/>
+        </w:rPr>
+        <w:t xml:space="preserve"> </w:t>
+      </w:r>
+      <w:proofErr w:type="spellStart"/>
+      <w:r>
+        <w:rPr>
+          <w:lang w:val="en-US"/>
+        </w:rPr>
+        <w:t>karyawan</w:t>
+      </w:r>
+      <w:proofErr w:type="spellEnd"/>
+      <w:r>
+        <w:rPr>
+          <w:lang w:val="en-US"/>
+        </w:rPr>
+        <w:t xml:space="preserve"> </w:t>
+      </w:r>
+      <w:proofErr w:type="spellStart"/>
+      <w:r>
+        <w:rPr>
+          <w:lang w:val="en-US"/>
+        </w:rPr>
+        <w:t>berdasarkan</w:t>
+      </w:r>
+      <w:proofErr w:type="spellEnd"/>
+      <w:r>
+        <w:rPr>
+          <w:lang w:val="en-US"/>
+        </w:rPr>
+        <w:t xml:space="preserve"> status </w:t>
+      </w:r>
+      <w:proofErr w:type="spellStart"/>
+      <w:r>
+        <w:rPr>
+          <w:lang w:val="en-US"/>
+        </w:rPr>
+        <w:t>penetapan</w:t>
+      </w:r>
+      <w:proofErr w:type="spellEnd"/>
+      <w:r>
+        <w:rPr>
+          <w:lang w:val="en-US"/>
+        </w:rPr>
+        <w:t>)</w:t>
+      </w:r>
+    </w:p>
+    <w:p>
+      <w:pPr>
+        <w:rPr>
+          <w:lang w:val="en-US"/>
+        </w:rPr>
+      </w:pPr>
+    </w:p>
+    <w:p>
+      <w:pPr>
+        <w:jc w:val="center"/>
+        <w:rPr>
+          <w:lang w:val="en-US"/>
+        </w:rPr>
+      </w:pPr>
+      <w:r>
+        <w:rPr>
+          <w:lang w:val="en-US"/>
+        </w:rPr>
+        <w:t>10 Mei 2025</w:t>
       </w:r>
     </w:p>
     <w:p>
@@ -763,338 +1247,532 @@
           <w:ilvl w:val="0"/>
           <w:numId w:val="1"/>
         </w:numPr>
-        <w:rPr>
-          <w:lang w:val="en-US"/>
-        </w:rPr>
-      </w:pPr>
-      <w:proofErr w:type="spellStart"/>
-      <w:r>
-        <w:rPr>
-          <w:lang w:val="en-US"/>
-        </w:rPr>
-        <w:t>Tambah</w:t>
-      </w:r>
-      <w:proofErr w:type="spellEnd"/>
-      <w:r>
-        <w:rPr>
-          <w:lang w:val="en-US"/>
-        </w:rPr>
-        <w:t xml:space="preserve"> </w:t>
-      </w:r>
-      <w:proofErr w:type="spellStart"/>
-      <w:r>
-        <w:rPr>
-          <w:lang w:val="en-US"/>
-        </w:rPr>
-        <w:t>keterangan</w:t>
-      </w:r>
-      <w:proofErr w:type="spellEnd"/>
-      <w:r>
-        <w:rPr>
-          <w:lang w:val="en-US"/>
-        </w:rPr>
-        <w:t xml:space="preserve"> </w:t>
-      </w:r>
-      <w:proofErr w:type="spellStart"/>
-      <w:r>
-        <w:rPr>
-          <w:lang w:val="en-US"/>
-        </w:rPr>
-        <w:t>juml</w:t>
-      </w:r>
-      <w:proofErr w:type="spellEnd"/>
-      <w:r>
-        <w:rPr>
-          <w:lang w:val="en-US"/>
-        </w:rPr>
-        <w:t xml:space="preserve"> Alpha di Dashboard E</w:t>
-      </w:r>
-      <w:r>
-        <w:rPr>
-          <w:lang w:val="en-US"/>
-        </w:rPr>
-        <w:t>-</w:t>
-      </w:r>
-      <w:proofErr w:type="spellStart"/>
-      <w:r>
-        <w:rPr>
-          <w:lang w:val="en-US"/>
-        </w:rPr>
-        <w:t>Absensi</w:t>
-      </w:r>
-      <w:proofErr w:type="spellEnd"/>
-    </w:p>
-    <w:p>
-      <w:pPr>
-        <w:rPr>
-          <w:lang w:val="en-US"/>
-        </w:rPr>
-      </w:pPr>
+        <w:jc w:val="both"/>
+        <w:rPr>
+          <w:lang w:val="en-US"/>
+        </w:rPr>
+      </w:pPr>
+      <w:r>
+        <w:rPr>
+          <w:lang w:val="en-US"/>
+        </w:rPr>
+        <w:t xml:space="preserve">Dinas </w:t>
+      </w:r>
+      <w:proofErr w:type="spellStart"/>
+      <w:r>
+        <w:rPr>
+          <w:lang w:val="en-US"/>
+        </w:rPr>
+        <w:t>luar</w:t>
+      </w:r>
+      <w:proofErr w:type="spellEnd"/>
+      <w:r>
+        <w:rPr>
+          <w:lang w:val="en-US"/>
+        </w:rPr>
+        <w:t xml:space="preserve"> </w:t>
+      </w:r>
+      <w:proofErr w:type="spellStart"/>
+      <w:r>
+        <w:rPr>
+          <w:lang w:val="en-US"/>
+        </w:rPr>
+        <w:t>wajib</w:t>
+      </w:r>
+      <w:proofErr w:type="spellEnd"/>
+      <w:r>
+        <w:rPr>
+          <w:lang w:val="en-US"/>
+        </w:rPr>
+        <w:t xml:space="preserve"> </w:t>
+      </w:r>
+      <w:proofErr w:type="spellStart"/>
+      <w:r>
+        <w:rPr>
+          <w:lang w:val="en-US"/>
+        </w:rPr>
+        <w:t>foto</w:t>
+      </w:r>
+      <w:proofErr w:type="spellEnd"/>
+      <w:r>
+        <w:rPr>
+          <w:lang w:val="en-US"/>
+        </w:rPr>
+        <w:t xml:space="preserve"> </w:t>
+      </w:r>
+      <w:proofErr w:type="spellStart"/>
+      <w:r>
+        <w:rPr>
+          <w:lang w:val="en-US"/>
+        </w:rPr>
+        <w:t>surat</w:t>
+      </w:r>
+      <w:proofErr w:type="spellEnd"/>
+      <w:r>
+        <w:rPr>
+          <w:lang w:val="en-US"/>
+        </w:rPr>
+        <w:t xml:space="preserve"> </w:t>
+      </w:r>
+      <w:proofErr w:type="spellStart"/>
+      <w:r>
+        <w:rPr>
+          <w:lang w:val="en-US"/>
+        </w:rPr>
+        <w:t>dinas</w:t>
+      </w:r>
+      <w:proofErr w:type="spellEnd"/>
+      <w:r>
+        <w:rPr>
+          <w:lang w:val="en-US"/>
+        </w:rPr>
+        <w:t xml:space="preserve"> </w:t>
+      </w:r>
+      <w:proofErr w:type="spellStart"/>
+      <w:r>
+        <w:rPr>
+          <w:lang w:val="en-US"/>
+        </w:rPr>
+        <w:t>luar</w:t>
+      </w:r>
+      <w:proofErr w:type="spellEnd"/>
+      <w:r>
+        <w:rPr>
+          <w:lang w:val="en-US"/>
+        </w:rPr>
+        <w:t xml:space="preserve"> (SAAT MULAI) dan upload </w:t>
+      </w:r>
+      <w:proofErr w:type="spellStart"/>
+      <w:r>
+        <w:rPr>
+          <w:lang w:val="en-US"/>
+        </w:rPr>
+        <w:t>foto</w:t>
+      </w:r>
+      <w:proofErr w:type="spellEnd"/>
+      <w:r>
+        <w:rPr>
+          <w:lang w:val="en-US"/>
+        </w:rPr>
+        <w:t xml:space="preserve"> </w:t>
+      </w:r>
+      <w:proofErr w:type="spellStart"/>
+      <w:r>
+        <w:rPr>
+          <w:lang w:val="en-US"/>
+        </w:rPr>
+        <w:t>kegiatan</w:t>
+      </w:r>
+      <w:proofErr w:type="spellEnd"/>
+      <w:r>
+        <w:rPr>
+          <w:lang w:val="en-US"/>
+        </w:rPr>
+        <w:t xml:space="preserve"> (SAAT SELESAI)</w:t>
+      </w:r>
     </w:p>
     <w:p>
       <w:pPr>
         <w:pStyle w:val="ListParagraph"/>
         <w:numPr>
           <w:ilvl w:val="0"/>
-          <w:numId w:val="3"/>
+          <w:numId w:val="1"/>
         </w:numPr>
-        <w:rPr>
-          <w:lang w:val="en-US"/>
-        </w:rPr>
-      </w:pPr>
-      <w:proofErr w:type="spellStart"/>
-      <w:r>
-        <w:rPr>
-          <w:lang w:val="en-US"/>
-        </w:rPr>
-        <w:t>Grafik</w:t>
-      </w:r>
-      <w:proofErr w:type="spellEnd"/>
-      <w:r>
-        <w:rPr>
-          <w:lang w:val="en-US"/>
-        </w:rPr>
-        <w:t xml:space="preserve"> di </w:t>
-      </w:r>
-      <w:proofErr w:type="spellStart"/>
-      <w:r>
-        <w:rPr>
-          <w:lang w:val="en-US"/>
-        </w:rPr>
-        <w:t>profil</w:t>
-      </w:r>
-      <w:proofErr w:type="spellEnd"/>
-      <w:r>
-        <w:rPr>
-          <w:lang w:val="en-US"/>
-        </w:rPr>
-        <w:t xml:space="preserve"> </w:t>
-      </w:r>
-      <w:proofErr w:type="spellStart"/>
-      <w:r>
-        <w:rPr>
-          <w:lang w:val="en-US"/>
-        </w:rPr>
-        <w:t>karyawan</w:t>
-      </w:r>
-      <w:proofErr w:type="spellEnd"/>
-      <w:r>
-        <w:rPr>
-          <w:lang w:val="en-US"/>
-        </w:rPr>
-        <w:t xml:space="preserve">: </w:t>
-      </w:r>
+        <w:jc w:val="both"/>
+        <w:rPr>
+          <w:lang w:val="en-US"/>
+        </w:rPr>
+      </w:pPr>
     </w:p>
     <w:p>
       <w:pPr>
-        <w:pStyle w:val="ListParagraph"/>
-        <w:numPr>
-          <w:ilvl w:val="1"/>
-          <w:numId w:val="3"/>
-        </w:numPr>
-        <w:rPr>
-          <w:lang w:val="en-US"/>
-        </w:rPr>
-      </w:pPr>
-      <w:r>
-        <w:rPr>
-          <w:lang w:val="en-US"/>
-        </w:rPr>
-        <w:t>Jenis (</w:t>
-      </w:r>
-      <w:proofErr w:type="spellStart"/>
-      <w:r>
-        <w:rPr>
-          <w:lang w:val="en-US"/>
-        </w:rPr>
-        <w:t>Medis</w:t>
-      </w:r>
-      <w:proofErr w:type="spellEnd"/>
-      <w:r>
-        <w:rPr>
-          <w:lang w:val="en-US"/>
-        </w:rPr>
-        <w:t xml:space="preserve"> / Non </w:t>
-      </w:r>
-      <w:proofErr w:type="spellStart"/>
-      <w:r>
-        <w:rPr>
-          <w:lang w:val="en-US"/>
-        </w:rPr>
-        <w:t>Medis</w:t>
-      </w:r>
-      <w:proofErr w:type="spellEnd"/>
-      <w:r>
-        <w:rPr>
-          <w:lang w:val="en-US"/>
-        </w:rPr>
-        <w:t>)</w:t>
-      </w:r>
-    </w:p>
-    <w:p>
-      <w:pPr>
-        <w:pStyle w:val="ListParagraph"/>
-        <w:numPr>
-          <w:ilvl w:val="1"/>
-          <w:numId w:val="3"/>
-        </w:numPr>
-        <w:rPr>
-          <w:lang w:val="en-US"/>
-        </w:rPr>
-      </w:pPr>
-      <w:r>
-        <w:rPr>
-          <w:lang w:val="en-US"/>
-        </w:rPr>
-        <w:t>Jenis Kelamin</w:t>
-      </w:r>
-    </w:p>
-    <w:p>
-      <w:pPr>
-        <w:pStyle w:val="ListParagraph"/>
-        <w:numPr>
-          <w:ilvl w:val="1"/>
-          <w:numId w:val="3"/>
-        </w:numPr>
-        <w:rPr>
-          <w:lang w:val="en-US"/>
-        </w:rPr>
-      </w:pPr>
-      <w:r>
-        <w:rPr>
-          <w:lang w:val="en-US"/>
-        </w:rPr>
-        <w:t>Pendidikan</w:t>
-      </w:r>
-    </w:p>
-    <w:p>
-      <w:pPr>
-        <w:pStyle w:val="ListParagraph"/>
-        <w:numPr>
-          <w:ilvl w:val="1"/>
-          <w:numId w:val="3"/>
-        </w:numPr>
-        <w:rPr>
-          <w:lang w:val="en-US"/>
-        </w:rPr>
-      </w:pPr>
-      <w:proofErr w:type="spellStart"/>
-      <w:r>
-        <w:rPr>
-          <w:lang w:val="en-US"/>
-        </w:rPr>
-        <w:t>Profesi</w:t>
-      </w:r>
-      <w:proofErr w:type="spellEnd"/>
-    </w:p>
-    <w:p>
-      <w:pPr>
-        <w:pStyle w:val="ListParagraph"/>
-        <w:numPr>
-          <w:ilvl w:val="1"/>
-          <w:numId w:val="3"/>
-        </w:numPr>
-        <w:rPr>
-          <w:lang w:val="en-US"/>
-        </w:rPr>
-      </w:pPr>
-      <w:r>
-        <w:rPr>
-          <w:lang w:val="en-US"/>
-        </w:rPr>
-        <w:t xml:space="preserve">Status </w:t>
-      </w:r>
-      <w:proofErr w:type="spellStart"/>
-      <w:r>
-        <w:rPr>
-          <w:lang w:val="en-US"/>
-        </w:rPr>
-        <w:t>pegawai</w:t>
-      </w:r>
-      <w:proofErr w:type="spellEnd"/>
+        <w:jc w:val="both"/>
+        <w:rPr>
+          <w:lang w:val="en-US"/>
+        </w:rPr>
+      </w:pPr>
+      <w:proofErr w:type="gramStart"/>
+      <w:r>
+        <w:rPr>
+          <w:lang w:val="en-US"/>
+        </w:rPr>
+        <w:t>Issue :</w:t>
+      </w:r>
+      <w:proofErr w:type="gramEnd"/>
     </w:p>
     <w:p>
       <w:pPr>
         <w:pStyle w:val="ListParagraph"/>
         <w:numPr>
           <w:ilvl w:val="0"/>
-          <w:numId w:val="3"/>
+          <w:numId w:val="4"/>
         </w:numPr>
-        <w:rPr>
-          <w:strike/>
-          <w:lang w:val="en-US"/>
-        </w:rPr>
-      </w:pPr>
-      <w:r>
-        <w:rPr>
-          <w:strike/>
-          <w:lang w:val="en-US"/>
-        </w:rPr>
-        <w:t xml:space="preserve">Status </w:t>
-      </w:r>
-      <w:proofErr w:type="spellStart"/>
-      <w:r>
-        <w:rPr>
-          <w:strike/>
-          <w:lang w:val="en-US"/>
-        </w:rPr>
-        <w:t>pegawai</w:t>
-      </w:r>
-      <w:proofErr w:type="spellEnd"/>
-      <w:r>
-        <w:rPr>
-          <w:strike/>
-          <w:lang w:val="en-US"/>
-        </w:rPr>
-        <w:t xml:space="preserve"> di </w:t>
-      </w:r>
-      <w:proofErr w:type="spellStart"/>
-      <w:r>
-        <w:rPr>
-          <w:strike/>
-          <w:lang w:val="en-US"/>
-        </w:rPr>
-        <w:t>penetapan</w:t>
-      </w:r>
-      <w:proofErr w:type="spellEnd"/>
-      <w:r>
-        <w:rPr>
-          <w:strike/>
-          <w:lang w:val="en-US"/>
-        </w:rPr>
-        <w:t xml:space="preserve"> </w:t>
-      </w:r>
-      <w:proofErr w:type="spellStart"/>
-      <w:r>
-        <w:rPr>
-          <w:strike/>
-          <w:lang w:val="en-US"/>
-        </w:rPr>
-        <w:t>ditambah</w:t>
-      </w:r>
-      <w:proofErr w:type="spellEnd"/>
-      <w:r>
-        <w:rPr>
-          <w:strike/>
-          <w:lang w:val="en-US"/>
-        </w:rPr>
-        <w:t xml:space="preserve"> “</w:t>
-      </w:r>
-      <w:proofErr w:type="spellStart"/>
-      <w:r>
-        <w:rPr>
-          <w:strike/>
-          <w:lang w:val="en-US"/>
-        </w:rPr>
-        <w:t>Meninggal</w:t>
-      </w:r>
-      <w:proofErr w:type="spellEnd"/>
-      <w:r>
-        <w:rPr>
-          <w:strike/>
-          <w:lang w:val="en-US"/>
-        </w:rPr>
-        <w:t>”</w:t>
+        <w:jc w:val="both"/>
+        <w:rPr>
+          <w:lang w:val="en-US"/>
+        </w:rPr>
+      </w:pPr>
+      <w:proofErr w:type="spellStart"/>
+      <w:r>
+        <w:rPr>
+          <w:lang w:val="en-US"/>
+        </w:rPr>
+        <w:t>Pegawai</w:t>
+      </w:r>
+      <w:proofErr w:type="spellEnd"/>
+      <w:r>
+        <w:rPr>
+          <w:lang w:val="en-US"/>
+        </w:rPr>
+        <w:t xml:space="preserve"> </w:t>
+      </w:r>
+      <w:proofErr w:type="spellStart"/>
+      <w:r>
+        <w:rPr>
+          <w:lang w:val="en-US"/>
+        </w:rPr>
+        <w:t>sudah</w:t>
+      </w:r>
+      <w:proofErr w:type="spellEnd"/>
+      <w:r>
+        <w:rPr>
+          <w:lang w:val="en-US"/>
+        </w:rPr>
+        <w:t xml:space="preserve"> </w:t>
+      </w:r>
+      <w:proofErr w:type="spellStart"/>
+      <w:r>
+        <w:rPr>
+          <w:lang w:val="en-US"/>
+        </w:rPr>
+        <w:t>absen</w:t>
+      </w:r>
+      <w:proofErr w:type="spellEnd"/>
+      <w:r>
+        <w:rPr>
+          <w:lang w:val="en-US"/>
+        </w:rPr>
+        <w:t xml:space="preserve"> </w:t>
+      </w:r>
+      <w:proofErr w:type="spellStart"/>
+      <w:r>
+        <w:rPr>
+          <w:lang w:val="en-US"/>
+        </w:rPr>
+        <w:t>masuk</w:t>
+      </w:r>
+      <w:proofErr w:type="spellEnd"/>
+      <w:r>
+        <w:rPr>
+          <w:lang w:val="en-US"/>
+        </w:rPr>
+        <w:t xml:space="preserve"> </w:t>
+      </w:r>
+      <w:proofErr w:type="spellStart"/>
+      <w:r>
+        <w:rPr>
+          <w:lang w:val="en-US"/>
+        </w:rPr>
+        <w:t>pagi</w:t>
+      </w:r>
+      <w:proofErr w:type="spellEnd"/>
+      <w:r>
+        <w:rPr>
+          <w:lang w:val="en-US"/>
+        </w:rPr>
+        <w:t xml:space="preserve">, </w:t>
+      </w:r>
+      <w:proofErr w:type="spellStart"/>
+      <w:r>
+        <w:rPr>
+          <w:lang w:val="en-US"/>
+        </w:rPr>
+        <w:t>siangnya</w:t>
+      </w:r>
+      <w:proofErr w:type="spellEnd"/>
+      <w:r>
+        <w:rPr>
+          <w:lang w:val="en-US"/>
+        </w:rPr>
+        <w:t xml:space="preserve"> </w:t>
+      </w:r>
+      <w:proofErr w:type="spellStart"/>
+      <w:r>
+        <w:rPr>
+          <w:lang w:val="en-US"/>
+        </w:rPr>
+        <w:t>ada</w:t>
+      </w:r>
+      <w:proofErr w:type="spellEnd"/>
+      <w:r>
+        <w:rPr>
+          <w:lang w:val="en-US"/>
+        </w:rPr>
+        <w:t xml:space="preserve"> </w:t>
+      </w:r>
+      <w:proofErr w:type="spellStart"/>
+      <w:r>
+        <w:rPr>
+          <w:lang w:val="en-US"/>
+        </w:rPr>
+        <w:t>dinas</w:t>
+      </w:r>
+      <w:proofErr w:type="spellEnd"/>
+      <w:r>
+        <w:rPr>
+          <w:lang w:val="en-US"/>
+        </w:rPr>
+        <w:t xml:space="preserve"> </w:t>
+      </w:r>
+      <w:proofErr w:type="spellStart"/>
+      <w:r>
+        <w:rPr>
+          <w:lang w:val="en-US"/>
+        </w:rPr>
+        <w:t>luar</w:t>
+      </w:r>
+      <w:proofErr w:type="spellEnd"/>
+      <w:r>
+        <w:rPr>
+          <w:lang w:val="en-US"/>
+        </w:rPr>
+        <w:t xml:space="preserve"> </w:t>
+      </w:r>
+      <w:proofErr w:type="spellStart"/>
+      <w:r>
+        <w:rPr>
+          <w:lang w:val="en-US"/>
+        </w:rPr>
+        <w:t>klik</w:t>
+      </w:r>
+      <w:proofErr w:type="spellEnd"/>
+      <w:r>
+        <w:rPr>
+          <w:lang w:val="en-US"/>
+        </w:rPr>
+        <w:t xml:space="preserve"> </w:t>
+      </w:r>
+      <w:proofErr w:type="spellStart"/>
+      <w:r>
+        <w:rPr>
+          <w:lang w:val="en-US"/>
+        </w:rPr>
+        <w:t>mulai</w:t>
+      </w:r>
+      <w:proofErr w:type="spellEnd"/>
+      <w:r>
+        <w:rPr>
+          <w:lang w:val="en-US"/>
+        </w:rPr>
+        <w:t xml:space="preserve"> </w:t>
+      </w:r>
+      <w:proofErr w:type="spellStart"/>
+      <w:r>
+        <w:rPr>
+          <w:lang w:val="en-US"/>
+        </w:rPr>
+        <w:t>dinas</w:t>
+      </w:r>
+      <w:proofErr w:type="spellEnd"/>
+      <w:r>
+        <w:rPr>
+          <w:lang w:val="en-US"/>
+        </w:rPr>
+        <w:t xml:space="preserve"> </w:t>
+      </w:r>
+      <w:proofErr w:type="spellStart"/>
+      <w:r>
+        <w:rPr>
+          <w:lang w:val="en-US"/>
+        </w:rPr>
+        <w:t>luar</w:t>
+      </w:r>
+      <w:proofErr w:type="spellEnd"/>
+      <w:r>
+        <w:rPr>
+          <w:lang w:val="en-US"/>
+        </w:rPr>
+        <w:t xml:space="preserve">, </w:t>
+      </w:r>
+      <w:proofErr w:type="spellStart"/>
+      <w:r>
+        <w:rPr>
+          <w:lang w:val="en-US"/>
+        </w:rPr>
+        <w:t>pulangnya</w:t>
+      </w:r>
+      <w:proofErr w:type="spellEnd"/>
+      <w:r>
+        <w:rPr>
+          <w:lang w:val="en-US"/>
+        </w:rPr>
+        <w:t xml:space="preserve"> </w:t>
+      </w:r>
+      <w:proofErr w:type="spellStart"/>
+      <w:r>
+        <w:rPr>
+          <w:lang w:val="en-US"/>
+        </w:rPr>
+        <w:t>wajib</w:t>
+      </w:r>
+      <w:proofErr w:type="spellEnd"/>
+      <w:r>
+        <w:rPr>
+          <w:lang w:val="en-US"/>
+        </w:rPr>
+        <w:t xml:space="preserve"> </w:t>
+      </w:r>
+      <w:proofErr w:type="spellStart"/>
+      <w:r>
+        <w:rPr>
+          <w:lang w:val="en-US"/>
+        </w:rPr>
+        <w:t>klik</w:t>
+      </w:r>
+      <w:proofErr w:type="spellEnd"/>
+      <w:r>
+        <w:rPr>
+          <w:lang w:val="en-US"/>
+        </w:rPr>
+        <w:t xml:space="preserve"> </w:t>
+      </w:r>
+      <w:proofErr w:type="spellStart"/>
+      <w:r>
+        <w:rPr>
+          <w:lang w:val="en-US"/>
+        </w:rPr>
+        <w:t>Selesai</w:t>
+      </w:r>
+      <w:proofErr w:type="spellEnd"/>
+      <w:r>
+        <w:rPr>
+          <w:lang w:val="en-US"/>
+        </w:rPr>
+        <w:t xml:space="preserve"> Dinas </w:t>
+      </w:r>
+      <w:proofErr w:type="spellStart"/>
+      <w:r>
+        <w:rPr>
+          <w:lang w:val="en-US"/>
+        </w:rPr>
+        <w:t>Luar</w:t>
+      </w:r>
+      <w:proofErr w:type="spellEnd"/>
+      <w:r>
+        <w:rPr>
+          <w:lang w:val="en-US"/>
+        </w:rPr>
+        <w:t xml:space="preserve"> </w:t>
+      </w:r>
+      <w:proofErr w:type="spellStart"/>
+      <w:r>
+        <w:rPr>
+          <w:lang w:val="en-US"/>
+        </w:rPr>
+        <w:t>lalu</w:t>
+      </w:r>
+      <w:proofErr w:type="spellEnd"/>
+      <w:r>
+        <w:rPr>
+          <w:lang w:val="en-US"/>
+        </w:rPr>
+        <w:t xml:space="preserve"> </w:t>
+      </w:r>
+      <w:proofErr w:type="spellStart"/>
+      <w:r>
+        <w:rPr>
+          <w:lang w:val="en-US"/>
+        </w:rPr>
+        <w:t>absen</w:t>
+      </w:r>
+      <w:proofErr w:type="spellEnd"/>
+      <w:r>
+        <w:rPr>
+          <w:lang w:val="en-US"/>
+        </w:rPr>
+        <w:t xml:space="preserve"> </w:t>
+      </w:r>
+      <w:proofErr w:type="spellStart"/>
+      <w:r>
+        <w:rPr>
+          <w:lang w:val="en-US"/>
+        </w:rPr>
+        <w:t>pulang</w:t>
+      </w:r>
+      <w:proofErr w:type="spellEnd"/>
+      <w:r>
+        <w:rPr>
+          <w:lang w:val="en-US"/>
+        </w:rPr>
+        <w:t xml:space="preserve"> (</w:t>
+      </w:r>
+      <w:r>
+        <w:rPr>
+          <w:lang w:val="en-US"/>
+        </w:rPr>
+        <w:t xml:space="preserve">GPS </w:t>
+      </w:r>
+      <w:proofErr w:type="spellStart"/>
+      <w:r>
+        <w:rPr>
+          <w:lang w:val="en-US"/>
+        </w:rPr>
+        <w:t>bebas</w:t>
+      </w:r>
+      <w:proofErr w:type="spellEnd"/>
+      <w:r>
+        <w:rPr>
+          <w:lang w:val="en-US"/>
+        </w:rPr>
+        <w:t xml:space="preserve"> </w:t>
+      </w:r>
+      <w:proofErr w:type="spellStart"/>
+      <w:r>
+        <w:rPr>
+          <w:lang w:val="en-US"/>
+        </w:rPr>
+        <w:t>dimanapun</w:t>
+      </w:r>
+      <w:proofErr w:type="spellEnd"/>
+      <w:r>
+        <w:rPr>
+          <w:lang w:val="en-US"/>
+        </w:rPr>
+        <w:t xml:space="preserve"> dan</w:t>
+      </w:r>
+      <w:r>
+        <w:rPr>
+          <w:lang w:val="en-US"/>
+        </w:rPr>
+        <w:t xml:space="preserve"> m</w:t>
+      </w:r>
+      <w:proofErr w:type="spellStart"/>
+      <w:r>
+        <w:rPr>
+          <w:lang w:val="en-US"/>
+        </w:rPr>
+        <w:t>aksimal</w:t>
+      </w:r>
+      <w:proofErr w:type="spellEnd"/>
+      <w:r>
+        <w:rPr>
+          <w:lang w:val="en-US"/>
+        </w:rPr>
+        <w:t xml:space="preserve"> </w:t>
+      </w:r>
+      <w:proofErr w:type="spellStart"/>
+      <w:r>
+        <w:rPr>
+          <w:lang w:val="en-US"/>
+        </w:rPr>
+        <w:t>sebelum</w:t>
+      </w:r>
+      <w:proofErr w:type="spellEnd"/>
+      <w:r>
+        <w:rPr>
+          <w:lang w:val="en-US"/>
+        </w:rPr>
+        <w:t xml:space="preserve"> 00:00)</w:t>
       </w:r>
     </w:p>
     <w:p>
@@ -1102,46 +1780,81 @@
         <w:pStyle w:val="ListParagraph"/>
         <w:numPr>
           <w:ilvl w:val="0"/>
-          <w:numId w:val="3"/>
+          <w:numId w:val="4"/>
         </w:numPr>
-        <w:rPr>
-          <w:lang w:val="en-US"/>
-        </w:rPr>
-      </w:pPr>
-      <w:proofErr w:type="spellStart"/>
-      <w:r>
-        <w:rPr>
-          <w:lang w:val="en-US"/>
-        </w:rPr>
-        <w:t>Tambah</w:t>
-      </w:r>
-      <w:proofErr w:type="spellEnd"/>
-      <w:r>
-        <w:rPr>
-          <w:lang w:val="en-US"/>
-        </w:rPr>
-        <w:t xml:space="preserve"> filter di </w:t>
-      </w:r>
-      <w:proofErr w:type="spellStart"/>
-      <w:r>
-        <w:rPr>
-          <w:lang w:val="en-US"/>
-        </w:rPr>
-        <w:t>profil</w:t>
-      </w:r>
-      <w:proofErr w:type="spellEnd"/>
-      <w:r>
-        <w:rPr>
-          <w:lang w:val="en-US"/>
-        </w:rPr>
-        <w:t xml:space="preserve"> </w:t>
-      </w:r>
-      <w:proofErr w:type="spellStart"/>
-      <w:r>
-        <w:rPr>
-          <w:lang w:val="en-US"/>
-        </w:rPr>
-        <w:t>kepegawaian</w:t>
+        <w:jc w:val="both"/>
+        <w:rPr>
+          <w:lang w:val="en-US"/>
+        </w:rPr>
+      </w:pPr>
+      <w:proofErr w:type="spellStart"/>
+      <w:r>
+        <w:rPr>
+          <w:lang w:val="en-US"/>
+        </w:rPr>
+        <w:t>Kondisi</w:t>
+      </w:r>
+      <w:proofErr w:type="spellEnd"/>
+      <w:r>
+        <w:rPr>
+          <w:lang w:val="en-US"/>
+        </w:rPr>
+        <w:t xml:space="preserve"> </w:t>
+      </w:r>
+      <w:proofErr w:type="spellStart"/>
+      <w:r>
+        <w:rPr>
+          <w:lang w:val="en-US"/>
+        </w:rPr>
+        <w:t>p</w:t>
+      </w:r>
+      <w:r>
+        <w:rPr>
+          <w:lang w:val="en-US"/>
+        </w:rPr>
+        <w:t>egawai</w:t>
+      </w:r>
+      <w:proofErr w:type="spellEnd"/>
+      <w:r>
+        <w:rPr>
+          <w:lang w:val="en-US"/>
+        </w:rPr>
+        <w:t xml:space="preserve"> </w:t>
+      </w:r>
+      <w:proofErr w:type="spellStart"/>
+      <w:r>
+        <w:rPr>
+          <w:lang w:val="en-US"/>
+        </w:rPr>
+        <w:t>belum</w:t>
+      </w:r>
+      <w:proofErr w:type="spellEnd"/>
+      <w:r>
+        <w:rPr>
+          <w:lang w:val="en-US"/>
+        </w:rPr>
+        <w:t xml:space="preserve"> </w:t>
+      </w:r>
+      <w:proofErr w:type="spellStart"/>
+      <w:r>
+        <w:rPr>
+          <w:lang w:val="en-US"/>
+        </w:rPr>
+        <w:t>absen</w:t>
+      </w:r>
+      <w:proofErr w:type="spellEnd"/>
+      <w:r>
+        <w:rPr>
+          <w:lang w:val="en-US"/>
+        </w:rPr>
+        <w:t xml:space="preserve"> </w:t>
+      </w:r>
+      <w:proofErr w:type="spellStart"/>
+      <w:r>
+        <w:rPr>
+          <w:lang w:val="en-US"/>
+        </w:rPr>
+        <w:t>masuk</w:t>
       </w:r>
       <w:proofErr w:type="spellEnd"/>
       <w:r>
@@ -1155,49 +1868,257 @@
         <w:rPr>
           <w:lang w:val="en-US"/>
         </w:rPr>
-        <w:t>pencarian</w:t>
-      </w:r>
-      <w:proofErr w:type="spellEnd"/>
-      <w:r>
-        <w:rPr>
-          <w:lang w:val="en-US"/>
-        </w:rPr>
-        <w:t xml:space="preserve"> </w:t>
-      </w:r>
-      <w:proofErr w:type="spellStart"/>
-      <w:r>
-        <w:rPr>
-          <w:lang w:val="en-US"/>
-        </w:rPr>
-        <w:t>karyawan</w:t>
-      </w:r>
-      <w:proofErr w:type="spellEnd"/>
-      <w:r>
-        <w:rPr>
-          <w:lang w:val="en-US"/>
-        </w:rPr>
-        <w:t xml:space="preserve"> </w:t>
-      </w:r>
-      <w:proofErr w:type="spellStart"/>
-      <w:r>
-        <w:rPr>
-          <w:lang w:val="en-US"/>
-        </w:rPr>
-        <w:t>berdasarkan</w:t>
-      </w:r>
-      <w:proofErr w:type="spellEnd"/>
-      <w:r>
-        <w:rPr>
-          <w:lang w:val="en-US"/>
-        </w:rPr>
-        <w:t xml:space="preserve"> status </w:t>
-      </w:r>
-      <w:proofErr w:type="spellStart"/>
-      <w:r>
-        <w:rPr>
-          <w:lang w:val="en-US"/>
-        </w:rPr>
-        <w:t>penetapan</w:t>
+        <w:t>ada</w:t>
+      </w:r>
+      <w:proofErr w:type="spellEnd"/>
+      <w:r>
+        <w:rPr>
+          <w:lang w:val="en-US"/>
+        </w:rPr>
+        <w:t xml:space="preserve"> </w:t>
+      </w:r>
+      <w:proofErr w:type="spellStart"/>
+      <w:r>
+        <w:rPr>
+          <w:lang w:val="en-US"/>
+        </w:rPr>
+        <w:t>jadwal</w:t>
+      </w:r>
+      <w:proofErr w:type="spellEnd"/>
+      <w:r>
+        <w:rPr>
+          <w:lang w:val="en-US"/>
+        </w:rPr>
+        <w:t xml:space="preserve"> shift), </w:t>
+      </w:r>
+      <w:proofErr w:type="spellStart"/>
+      <w:r>
+        <w:rPr>
+          <w:lang w:val="en-US"/>
+        </w:rPr>
+        <w:t>sebelumnya</w:t>
+      </w:r>
+      <w:proofErr w:type="spellEnd"/>
+      <w:r>
+        <w:rPr>
+          <w:lang w:val="en-US"/>
+        </w:rPr>
+        <w:t xml:space="preserve"> </w:t>
+      </w:r>
+      <w:proofErr w:type="spellStart"/>
+      <w:r>
+        <w:rPr>
+          <w:lang w:val="en-US"/>
+        </w:rPr>
+        <w:t>sudah</w:t>
+      </w:r>
+      <w:proofErr w:type="spellEnd"/>
+      <w:r>
+        <w:rPr>
+          <w:lang w:val="en-US"/>
+        </w:rPr>
+        <w:t xml:space="preserve"> </w:t>
+      </w:r>
+      <w:proofErr w:type="spellStart"/>
+      <w:r>
+        <w:rPr>
+          <w:lang w:val="en-US"/>
+        </w:rPr>
+        <w:t>klik</w:t>
+      </w:r>
+      <w:proofErr w:type="spellEnd"/>
+      <w:r>
+        <w:rPr>
+          <w:lang w:val="en-US"/>
+        </w:rPr>
+        <w:t xml:space="preserve"> </w:t>
+      </w:r>
+      <w:proofErr w:type="spellStart"/>
+      <w:r>
+        <w:rPr>
+          <w:lang w:val="en-US"/>
+        </w:rPr>
+        <w:t>mulai</w:t>
+      </w:r>
+      <w:proofErr w:type="spellEnd"/>
+      <w:r>
+        <w:rPr>
+          <w:lang w:val="en-US"/>
+        </w:rPr>
+        <w:t xml:space="preserve"> </w:t>
+      </w:r>
+      <w:proofErr w:type="spellStart"/>
+      <w:r>
+        <w:rPr>
+          <w:lang w:val="en-US"/>
+        </w:rPr>
+        <w:t>dinas</w:t>
+      </w:r>
+      <w:proofErr w:type="spellEnd"/>
+      <w:r>
+        <w:rPr>
+          <w:lang w:val="en-US"/>
+        </w:rPr>
+        <w:t xml:space="preserve"> </w:t>
+      </w:r>
+      <w:proofErr w:type="spellStart"/>
+      <w:r>
+        <w:rPr>
+          <w:lang w:val="en-US"/>
+        </w:rPr>
+        <w:t>luar</w:t>
+      </w:r>
+      <w:proofErr w:type="spellEnd"/>
+      <w:r>
+        <w:rPr>
+          <w:lang w:val="en-US"/>
+        </w:rPr>
+        <w:t xml:space="preserve"> </w:t>
+      </w:r>
+      <w:proofErr w:type="spellStart"/>
+      <w:r>
+        <w:rPr>
+          <w:lang w:val="en-US"/>
+        </w:rPr>
+        <w:t>selanjutnya</w:t>
+      </w:r>
+      <w:proofErr w:type="spellEnd"/>
+      <w:r>
+        <w:rPr>
+          <w:lang w:val="en-US"/>
+        </w:rPr>
+        <w:t xml:space="preserve"> </w:t>
+      </w:r>
+      <w:proofErr w:type="spellStart"/>
+      <w:r>
+        <w:rPr>
+          <w:lang w:val="en-US"/>
+        </w:rPr>
+        <w:t>absen</w:t>
+      </w:r>
+      <w:proofErr w:type="spellEnd"/>
+      <w:r>
+        <w:rPr>
+          <w:lang w:val="en-US"/>
+        </w:rPr>
+        <w:t xml:space="preserve"> </w:t>
+      </w:r>
+      <w:proofErr w:type="spellStart"/>
+      <w:r>
+        <w:rPr>
+          <w:lang w:val="en-US"/>
+        </w:rPr>
+        <w:t>masuk</w:t>
+      </w:r>
+      <w:proofErr w:type="spellEnd"/>
+      <w:r>
+        <w:rPr>
+          <w:lang w:val="en-US"/>
+        </w:rPr>
+        <w:t xml:space="preserve"> </w:t>
+      </w:r>
+      <w:proofErr w:type="spellStart"/>
+      <w:r>
+        <w:rPr>
+          <w:lang w:val="en-US"/>
+        </w:rPr>
+        <w:t>sudah</w:t>
+      </w:r>
+      <w:proofErr w:type="spellEnd"/>
+      <w:r>
+        <w:rPr>
+          <w:lang w:val="en-US"/>
+        </w:rPr>
+        <w:t xml:space="preserve"> </w:t>
+      </w:r>
+      <w:proofErr w:type="spellStart"/>
+      <w:r>
+        <w:rPr>
+          <w:lang w:val="en-US"/>
+        </w:rPr>
+        <w:t>terhitung</w:t>
+      </w:r>
+      <w:proofErr w:type="spellEnd"/>
+      <w:r>
+        <w:rPr>
+          <w:lang w:val="en-US"/>
+        </w:rPr>
+        <w:t xml:space="preserve"> </w:t>
+      </w:r>
+      <w:r>
+        <w:rPr>
+          <w:lang w:val="en-US"/>
+        </w:rPr>
+        <w:t>(</w:t>
+      </w:r>
+      <w:r>
+        <w:rPr>
+          <w:lang w:val="en-US"/>
+        </w:rPr>
+        <w:t xml:space="preserve">jam </w:t>
+      </w:r>
+      <w:proofErr w:type="spellStart"/>
+      <w:r>
+        <w:rPr>
+          <w:lang w:val="en-US"/>
+        </w:rPr>
+        <w:t>masuk</w:t>
+      </w:r>
+      <w:proofErr w:type="spellEnd"/>
+      <w:r>
+        <w:rPr>
+          <w:lang w:val="en-US"/>
+        </w:rPr>
+        <w:t xml:space="preserve"> </w:t>
+      </w:r>
+      <w:proofErr w:type="spellStart"/>
+      <w:r>
+        <w:rPr>
+          <w:lang w:val="en-US"/>
+        </w:rPr>
+        <w:t>sama</w:t>
+      </w:r>
+      <w:proofErr w:type="spellEnd"/>
+      <w:r>
+        <w:rPr>
+          <w:lang w:val="en-US"/>
+        </w:rPr>
+        <w:t xml:space="preserve"> </w:t>
+      </w:r>
+      <w:proofErr w:type="spellStart"/>
+      <w:r>
+        <w:rPr>
+          <w:lang w:val="en-US"/>
+        </w:rPr>
+        <w:t>dengan</w:t>
+      </w:r>
+      <w:proofErr w:type="spellEnd"/>
+      <w:r>
+        <w:rPr>
+          <w:lang w:val="en-US"/>
+        </w:rPr>
+        <w:t xml:space="preserve"> </w:t>
+      </w:r>
+      <w:proofErr w:type="spellStart"/>
+      <w:r>
+        <w:rPr>
+          <w:lang w:val="en-US"/>
+        </w:rPr>
+        <w:t>mulai</w:t>
+      </w:r>
+      <w:proofErr w:type="spellEnd"/>
+      <w:r>
+        <w:rPr>
+          <w:lang w:val="en-US"/>
+        </w:rPr>
+        <w:t xml:space="preserve"> </w:t>
+      </w:r>
+      <w:proofErr w:type="spellStart"/>
+      <w:r>
+        <w:rPr>
+          <w:lang w:val="en-US"/>
+        </w:rPr>
+        <w:t>dinas</w:t>
       </w:r>
       <w:proofErr w:type="spellEnd"/>
       <w:r>
@@ -1206,15 +2127,240 @@
         </w:rPr>
         <w:t>)</w:t>
       </w:r>
-    </w:p>
-    <w:p>
-      <w:pPr>
-        <w:pStyle w:val="ListParagraph"/>
-        <w:ind w:left="1080"/>
-        <w:rPr>
-          <w:lang w:val="en-US"/>
-        </w:rPr>
-      </w:pPr>
+      <w:r>
+        <w:rPr>
+          <w:lang w:val="en-US"/>
+        </w:rPr>
+        <w:t>.</w:t>
+      </w:r>
+      <w:r>
+        <w:rPr>
+          <w:lang w:val="en-US"/>
+        </w:rPr>
+        <w:t xml:space="preserve"> </w:t>
+      </w:r>
+      <w:proofErr w:type="spellStart"/>
+      <w:r>
+        <w:rPr>
+          <w:lang w:val="en-US"/>
+        </w:rPr>
+        <w:t>S</w:t>
+      </w:r>
+      <w:r>
+        <w:rPr>
+          <w:lang w:val="en-US"/>
+        </w:rPr>
+        <w:t>etelah</w:t>
+      </w:r>
+      <w:proofErr w:type="spellEnd"/>
+      <w:r>
+        <w:rPr>
+          <w:lang w:val="en-US"/>
+        </w:rPr>
+        <w:t xml:space="preserve"> </w:t>
+      </w:r>
+      <w:proofErr w:type="spellStart"/>
+      <w:r>
+        <w:rPr>
+          <w:lang w:val="en-US"/>
+        </w:rPr>
+        <w:t>selesai</w:t>
+      </w:r>
+      <w:proofErr w:type="spellEnd"/>
+      <w:r>
+        <w:rPr>
+          <w:lang w:val="en-US"/>
+        </w:rPr>
+        <w:t xml:space="preserve"> </w:t>
+      </w:r>
+      <w:proofErr w:type="spellStart"/>
+      <w:r>
+        <w:rPr>
+          <w:lang w:val="en-US"/>
+        </w:rPr>
+        <w:t>dinas</w:t>
+      </w:r>
+      <w:proofErr w:type="spellEnd"/>
+      <w:r>
+        <w:rPr>
+          <w:lang w:val="en-US"/>
+        </w:rPr>
+        <w:t>,</w:t>
+      </w:r>
+      <w:r>
+        <w:rPr>
+          <w:lang w:val="en-US"/>
+        </w:rPr>
+        <w:t xml:space="preserve"> </w:t>
+      </w:r>
+      <w:proofErr w:type="spellStart"/>
+      <w:r>
+        <w:rPr>
+          <w:lang w:val="en-US"/>
+        </w:rPr>
+        <w:t>klik</w:t>
+      </w:r>
+      <w:proofErr w:type="spellEnd"/>
+      <w:r>
+        <w:rPr>
+          <w:lang w:val="en-US"/>
+        </w:rPr>
+        <w:t xml:space="preserve"> </w:t>
+      </w:r>
+      <w:proofErr w:type="spellStart"/>
+      <w:r>
+        <w:rPr>
+          <w:lang w:val="en-US"/>
+        </w:rPr>
+        <w:t>tombol</w:t>
+      </w:r>
+      <w:proofErr w:type="spellEnd"/>
+      <w:r>
+        <w:rPr>
+          <w:lang w:val="en-US"/>
+        </w:rPr>
+        <w:t xml:space="preserve"> </w:t>
+      </w:r>
+      <w:proofErr w:type="spellStart"/>
+      <w:r>
+        <w:rPr>
+          <w:lang w:val="en-US"/>
+        </w:rPr>
+        <w:t>selesai</w:t>
+      </w:r>
+      <w:proofErr w:type="spellEnd"/>
+      <w:r>
+        <w:rPr>
+          <w:lang w:val="en-US"/>
+        </w:rPr>
+        <w:t xml:space="preserve"> </w:t>
+      </w:r>
+      <w:proofErr w:type="spellStart"/>
+      <w:r>
+        <w:rPr>
+          <w:lang w:val="en-US"/>
+        </w:rPr>
+        <w:t>dinas</w:t>
+      </w:r>
+      <w:proofErr w:type="spellEnd"/>
+      <w:r>
+        <w:rPr>
+          <w:lang w:val="en-US"/>
+        </w:rPr>
+        <w:t xml:space="preserve"> </w:t>
+      </w:r>
+      <w:proofErr w:type="spellStart"/>
+      <w:r>
+        <w:rPr>
+          <w:lang w:val="en-US"/>
+        </w:rPr>
+        <w:t>luar</w:t>
+      </w:r>
+      <w:proofErr w:type="spellEnd"/>
+      <w:r>
+        <w:rPr>
+          <w:lang w:val="en-US"/>
+        </w:rPr>
+        <w:t xml:space="preserve"> </w:t>
+      </w:r>
+      <w:proofErr w:type="spellStart"/>
+      <w:r>
+        <w:rPr>
+          <w:lang w:val="en-US"/>
+        </w:rPr>
+        <w:t>lalu</w:t>
+      </w:r>
+      <w:proofErr w:type="spellEnd"/>
+      <w:r>
+        <w:rPr>
+          <w:lang w:val="en-US"/>
+        </w:rPr>
+        <w:t xml:space="preserve"> </w:t>
+      </w:r>
+      <w:proofErr w:type="spellStart"/>
+      <w:r>
+        <w:rPr>
+          <w:lang w:val="en-US"/>
+        </w:rPr>
+        <w:t>absen</w:t>
+      </w:r>
+      <w:proofErr w:type="spellEnd"/>
+      <w:r>
+        <w:rPr>
+          <w:lang w:val="en-US"/>
+        </w:rPr>
+        <w:t xml:space="preserve"> </w:t>
+      </w:r>
+      <w:proofErr w:type="spellStart"/>
+      <w:r>
+        <w:rPr>
+          <w:lang w:val="en-US"/>
+        </w:rPr>
+        <w:t>pulang</w:t>
+      </w:r>
+      <w:proofErr w:type="spellEnd"/>
+      <w:r>
+        <w:rPr>
+          <w:lang w:val="en-US"/>
+        </w:rPr>
+        <w:t xml:space="preserve"> (GPS </w:t>
+      </w:r>
+      <w:proofErr w:type="spellStart"/>
+      <w:r>
+        <w:rPr>
+          <w:lang w:val="en-US"/>
+        </w:rPr>
+        <w:t>bebas</w:t>
+      </w:r>
+      <w:proofErr w:type="spellEnd"/>
+      <w:r>
+        <w:rPr>
+          <w:lang w:val="en-US"/>
+        </w:rPr>
+        <w:t xml:space="preserve"> </w:t>
+      </w:r>
+      <w:proofErr w:type="spellStart"/>
+      <w:r>
+        <w:rPr>
+          <w:lang w:val="en-US"/>
+        </w:rPr>
+        <w:t>dimanapun</w:t>
+      </w:r>
+      <w:proofErr w:type="spellEnd"/>
+      <w:r>
+        <w:rPr>
+          <w:lang w:val="en-US"/>
+        </w:rPr>
+        <w:t xml:space="preserve"> dan </w:t>
+      </w:r>
+      <w:proofErr w:type="spellStart"/>
+      <w:r>
+        <w:rPr>
+          <w:lang w:val="en-US"/>
+        </w:rPr>
+        <w:t>maksimal</w:t>
+      </w:r>
+      <w:proofErr w:type="spellEnd"/>
+      <w:r>
+        <w:rPr>
+          <w:lang w:val="en-US"/>
+        </w:rPr>
+        <w:t xml:space="preserve"> </w:t>
+      </w:r>
+      <w:proofErr w:type="spellStart"/>
+      <w:r>
+        <w:rPr>
+          <w:lang w:val="en-US"/>
+        </w:rPr>
+        <w:t>sebelum</w:t>
+      </w:r>
+      <w:proofErr w:type="spellEnd"/>
+      <w:r>
+        <w:rPr>
+          <w:lang w:val="en-US"/>
+        </w:rPr>
+        <w:t xml:space="preserve"> 00:00)</w:t>
+      </w:r>
     </w:p>
     <w:sectPr>
       <w:pgSz w:w="12240" w:h="15840"/>
@@ -1430,6 +2576,95 @@
     </w:lvl>
   </w:abstractNum>
   <w:abstractNum w:abstractNumId="2" w15:restartNumberingAfterBreak="0">
+    <w:nsid w:val="77B119C3"/>
+    <w:multiLevelType w:val="hybridMultilevel"/>
+    <w:tmpl w:val="53F683CA"/>
+    <w:lvl w:ilvl="0" w:tplc="0409000F">
+      <w:start w:val="1"/>
+      <w:numFmt w:val="decimal"/>
+      <w:lvlText w:val="%1."/>
+      <w:lvlJc w:val="left"/>
+      <w:pPr>
+        <w:ind w:left="720" w:hanging="360"/>
+      </w:pPr>
+      <w:rPr>
+        <w:rFonts w:hint="default"/>
+      </w:rPr>
+    </w:lvl>
+    <w:lvl w:ilvl="1" w:tplc="04090019" w:tentative="1">
+      <w:start w:val="1"/>
+      <w:numFmt w:val="lowerLetter"/>
+      <w:lvlText w:val="%2."/>
+      <w:lvlJc w:val="left"/>
+      <w:pPr>
+        <w:ind w:left="1440" w:hanging="360"/>
+      </w:pPr>
+    </w:lvl>
+    <w:lvl w:ilvl="2" w:tplc="0409001B" w:tentative="1">
+      <w:start w:val="1"/>
+      <w:numFmt w:val="lowerRoman"/>
+      <w:lvlText w:val="%3."/>
+      <w:lvlJc w:val="right"/>
+      <w:pPr>
+        <w:ind w:left="2160" w:hanging="180"/>
+      </w:pPr>
+    </w:lvl>
+    <w:lvl w:ilvl="3" w:tplc="0409000F" w:tentative="1">
+      <w:start w:val="1"/>
+      <w:numFmt w:val="decimal"/>
+      <w:lvlText w:val="%4."/>
+      <w:lvlJc w:val="left"/>
+      <w:pPr>
+        <w:ind w:left="2880" w:hanging="360"/>
+      </w:pPr>
+    </w:lvl>
+    <w:lvl w:ilvl="4" w:tplc="04090019" w:tentative="1">
+      <w:start w:val="1"/>
+      <w:numFmt w:val="lowerLetter"/>
+      <w:lvlText w:val="%5."/>
+      <w:lvlJc w:val="left"/>
+      <w:pPr>
+        <w:ind w:left="3600" w:hanging="360"/>
+      </w:pPr>
+    </w:lvl>
+    <w:lvl w:ilvl="5" w:tplc="0409001B" w:tentative="1">
+      <w:start w:val="1"/>
+      <w:numFmt w:val="lowerRoman"/>
+      <w:lvlText w:val="%6."/>
+      <w:lvlJc w:val="right"/>
+      <w:pPr>
+        <w:ind w:left="4320" w:hanging="180"/>
+      </w:pPr>
+    </w:lvl>
+    <w:lvl w:ilvl="6" w:tplc="0409000F" w:tentative="1">
+      <w:start w:val="1"/>
+      <w:numFmt w:val="decimal"/>
+      <w:lvlText w:val="%7."/>
+      <w:lvlJc w:val="left"/>
+      <w:pPr>
+        <w:ind w:left="5040" w:hanging="360"/>
+      </w:pPr>
+    </w:lvl>
+    <w:lvl w:ilvl="7" w:tplc="04090019" w:tentative="1">
+      <w:start w:val="1"/>
+      <w:numFmt w:val="lowerLetter"/>
+      <w:lvlText w:val="%8."/>
+      <w:lvlJc w:val="left"/>
+      <w:pPr>
+        <w:ind w:left="5760" w:hanging="360"/>
+      </w:pPr>
+    </w:lvl>
+    <w:lvl w:ilvl="8" w:tplc="0409001B" w:tentative="1">
+      <w:start w:val="1"/>
+      <w:numFmt w:val="lowerRoman"/>
+      <w:lvlText w:val="%9."/>
+      <w:lvlJc w:val="right"/>
+      <w:pPr>
+        <w:ind w:left="6480" w:hanging="180"/>
+      </w:pPr>
+    </w:lvl>
+  </w:abstractNum>
+  <w:abstractNum w:abstractNumId="3" w15:restartNumberingAfterBreak="0">
     <w:nsid w:val="786469B4"/>
     <w:multiLevelType w:val="hybridMultilevel"/>
     <w:tmpl w:val="43581274"/>
@@ -1525,6 +2760,9 @@
     <w:abstractNumId w:val="0"/>
   </w:num>
   <w:num w:numId="3" w16cid:durableId="59866621">
+    <w:abstractNumId w:val="3"/>
+  </w:num>
+  <w:num w:numId="4" w16cid:durableId="1081828272">
     <w:abstractNumId w:val="2"/>
   </w:num>
 </w:numbering>

</xml_diff>